<commit_message>
fix(email): enforce verified domain security@catalogforge.tech to allow sending to any recipient
</commit_message>
<xml_diff>
--- a/CATALOGFORGE_DOCUMENTATION.docx
+++ b/CATALOGFORGE_DOCUMENTATION.docx
@@ -32,6 +32,14 @@
                 <w:sz w:val="64"/>
               </w:rPr>
               <w:t>CATALOGFORGE</w:t>
+            </w:r>
+            <w:r>
+              <w:rPr>
+                <w:b/>
+                <w:color w:val="FFFFFF"/>
+                <w:sz w:val="64"/>
+              </w:rPr>
+              <w:t>.tech</w:t>
             </w:r>
           </w:p>
         </w:tc>
@@ -74,16 +82,17 @@
         <w:tblLook w:val="04A0" w:firstRow="1" w:lastRow="0" w:firstColumn="1" w:lastColumn="0" w:noHBand="0" w:noVBand="1"/>
       </w:tblPr>
       <w:tblGrid>
-        <w:gridCol w:w="2880"/>
-        <w:gridCol w:w="6480"/>
+        <w:gridCol w:w="1855"/>
+        <w:gridCol w:w="4175"/>
       </w:tblGrid>
       <w:tr>
         <w:trPr>
+          <w:trHeight w:val="506"/>
           <w:jc w:val="center"/>
         </w:trPr>
         <w:tc>
           <w:tcPr>
-            <w:tcW w:w="2880" w:type="dxa"/>
+            <w:tcW w:w="1855" w:type="dxa"/>
             <w:shd w:val="clear" w:color="auto" w:fill="E8F2FF"/>
           </w:tcPr>
           <w:p>
@@ -102,7 +111,7 @@
         </w:tc>
         <w:tc>
           <w:tcPr>
-            <w:tcW w:w="6480" w:type="dxa"/>
+            <w:tcW w:w="4175" w:type="dxa"/>
           </w:tcPr>
           <w:p>
             <w:pPr>
@@ -120,11 +129,12 @@
       </w:tr>
       <w:tr>
         <w:trPr>
+          <w:trHeight w:val="522"/>
           <w:jc w:val="center"/>
         </w:trPr>
         <w:tc>
           <w:tcPr>
-            <w:tcW w:w="2880" w:type="dxa"/>
+            <w:tcW w:w="1855" w:type="dxa"/>
             <w:shd w:val="clear" w:color="auto" w:fill="E8F2FF"/>
           </w:tcPr>
           <w:p>
@@ -143,7 +153,7 @@
         </w:tc>
         <w:tc>
           <w:tcPr>
-            <w:tcW w:w="6480" w:type="dxa"/>
+            <w:tcW w:w="4175" w:type="dxa"/>
           </w:tcPr>
           <w:p>
             <w:pPr>
@@ -161,11 +171,12 @@
       </w:tr>
       <w:tr>
         <w:trPr>
+          <w:trHeight w:val="506"/>
           <w:jc w:val="center"/>
         </w:trPr>
         <w:tc>
           <w:tcPr>
-            <w:tcW w:w="2880" w:type="dxa"/>
+            <w:tcW w:w="1855" w:type="dxa"/>
             <w:shd w:val="clear" w:color="auto" w:fill="E8F2FF"/>
           </w:tcPr>
           <w:p>
@@ -184,7 +195,7 @@
         </w:tc>
         <w:tc>
           <w:tcPr>
-            <w:tcW w:w="6480" w:type="dxa"/>
+            <w:tcW w:w="4175" w:type="dxa"/>
           </w:tcPr>
           <w:p>
             <w:pPr>
@@ -201,802 +212,86 @@
         </w:tc>
       </w:tr>
     </w:tbl>
+    <w:p/>
+    <w:p/>
+    <w:p/>
     <w:p>
       <w:r>
-        <w:br w:type="page"/>
-      </w:r>
-    </w:p>
-    <w:p>
-      <w:pPr>
-        <w:spacing w:after="240"/>
-        <w:jc w:val="center"/>
-      </w:pPr>
-      <w:r>
-        <w:rPr>
-          <w:b/>
-          <w:color w:val="0B244A"/>
-          <w:sz w:val="32"/>
-        </w:rPr>
-        <w:lastRenderedPageBreak/>
-        <w:t>TABLE OF CONTENTS</w:t>
+        <w:drawing>
+          <wp:inline distT="0" distB="0" distL="0" distR="0" wp14:anchorId="286FE41E" wp14:editId="13668509">
+            <wp:extent cx="5943600" cy="2354580"/>
+            <wp:effectExtent l="0" t="0" r="0" b="7620"/>
+            <wp:docPr id="1033002480" name="Picture 1"/>
+            <wp:cNvGraphicFramePr>
+              <a:graphicFrameLocks xmlns:a="http://schemas.openxmlformats.org/drawingml/2006/main" noChangeAspect="1"/>
+            </wp:cNvGraphicFramePr>
+            <a:graphic xmlns:a="http://schemas.openxmlformats.org/drawingml/2006/main">
+              <a:graphicData uri="http://schemas.openxmlformats.org/drawingml/2006/picture">
+                <pic:pic xmlns:pic="http://schemas.openxmlformats.org/drawingml/2006/picture">
+                  <pic:nvPicPr>
+                    <pic:cNvPr id="1033002480" name=""/>
+                    <pic:cNvPicPr/>
+                  </pic:nvPicPr>
+                  <pic:blipFill>
+                    <a:blip r:embed="rId6"/>
+                    <a:stretch>
+                      <a:fillRect/>
+                    </a:stretch>
+                  </pic:blipFill>
+                  <pic:spPr>
+                    <a:xfrm>
+                      <a:off x="0" y="0"/>
+                      <a:ext cx="5943600" cy="2354580"/>
+                    </a:xfrm>
+                    <a:prstGeom prst="rect">
+                      <a:avLst/>
+                    </a:prstGeom>
+                  </pic:spPr>
+                </pic:pic>
+              </a:graphicData>
+            </a:graphic>
+          </wp:inline>
+        </w:drawing>
       </w:r>
     </w:p>
     <w:p>
       <w:pPr>
         <w:pBdr>
-          <w:bottom w:val="single" w:sz="6" w:space="1" w:color="B0C4DE"/>
+          <w:bottom w:val="single" w:sz="12" w:space="4" w:color="0B244A"/>
         </w:pBdr>
-        <w:spacing w:before="40" w:after="40"/>
+        <w:spacing w:before="360"/>
+        <w:rPr>
+          <w:b/>
+          <w:color w:val="0B244A"/>
+          <w:sz w:val="40"/>
+        </w:rPr>
       </w:pPr>
     </w:p>
     <w:p>
       <w:pPr>
-        <w:spacing w:before="20" w:after="40"/>
+        <w:pBdr>
+          <w:bottom w:val="single" w:sz="12" w:space="4" w:color="0B244A"/>
+        </w:pBdr>
+        <w:spacing w:before="360"/>
         <w:rPr>
-          <w:sz w:val="24"/>
-          <w:szCs w:val="24"/>
+          <w:b/>
+          <w:color w:val="0B244A"/>
+          <w:sz w:val="40"/>
         </w:rPr>
       </w:pPr>
-      <w:r>
-        <w:rPr>
-          <w:b/>
-          <w:color w:val="004080"/>
-          <w:sz w:val="24"/>
-          <w:szCs w:val="24"/>
-        </w:rPr>
-        <w:t xml:space="preserve">  1. </w:t>
-      </w:r>
-      <w:r>
-        <w:rPr>
-          <w:color w:val="1A1A1A"/>
-          <w:sz w:val="24"/>
-          <w:szCs w:val="24"/>
-        </w:rPr>
-        <w:t>Project Overview &amp; Problem Statement</w:t>
-      </w:r>
     </w:p>
     <w:p>
       <w:pPr>
-        <w:spacing w:before="20" w:after="40"/>
+        <w:pBdr>
+          <w:bottom w:val="single" w:sz="12" w:space="4" w:color="0B244A"/>
+        </w:pBdr>
+        <w:spacing w:before="360"/>
         <w:rPr>
-          <w:sz w:val="24"/>
-          <w:szCs w:val="24"/>
+          <w:b/>
+          <w:color w:val="0B244A"/>
+          <w:sz w:val="40"/>
         </w:rPr>
       </w:pPr>
-      <w:r>
-        <w:rPr>
-          <w:b/>
-          <w:color w:val="004080"/>
-          <w:sz w:val="24"/>
-          <w:szCs w:val="24"/>
-        </w:rPr>
-        <w:t xml:space="preserve">  2. </w:t>
-      </w:r>
-      <w:r>
-        <w:rPr>
-          <w:color w:val="1A1A1A"/>
-          <w:sz w:val="24"/>
-          <w:szCs w:val="24"/>
-        </w:rPr>
-        <w:t>How CatalogForge Works — End-to-End</w:t>
-      </w:r>
-    </w:p>
-    <w:p>
-      <w:pPr>
-        <w:spacing w:before="20" w:after="40"/>
-        <w:rPr>
-          <w:sz w:val="24"/>
-          <w:szCs w:val="24"/>
-        </w:rPr>
-      </w:pPr>
-      <w:r>
-        <w:rPr>
-          <w:b/>
-          <w:color w:val="004080"/>
-          <w:sz w:val="24"/>
-          <w:szCs w:val="24"/>
-        </w:rPr>
-        <w:t xml:space="preserve">  3. </w:t>
-      </w:r>
-      <w:r>
-        <w:rPr>
-          <w:color w:val="1A1A1A"/>
-          <w:sz w:val="24"/>
-          <w:szCs w:val="24"/>
-        </w:rPr>
-        <w:t>Complete Pipeline Architecture</w:t>
-      </w:r>
-    </w:p>
-    <w:p>
-      <w:pPr>
-        <w:spacing w:before="20" w:after="40"/>
-        <w:rPr>
-          <w:sz w:val="24"/>
-          <w:szCs w:val="24"/>
-        </w:rPr>
-      </w:pPr>
-      <w:r>
-        <w:rPr>
-          <w:b/>
-          <w:color w:val="004080"/>
-          <w:sz w:val="24"/>
-          <w:szCs w:val="24"/>
-        </w:rPr>
-        <w:t xml:space="preserve">  4. </w:t>
-      </w:r>
-      <w:r>
-        <w:rPr>
-          <w:color w:val="1A1A1A"/>
-          <w:sz w:val="24"/>
-          <w:szCs w:val="24"/>
-        </w:rPr>
-        <w:t>Pipeline Processing — Detailed Flow Table</w:t>
-      </w:r>
-    </w:p>
-    <w:p>
-      <w:pPr>
-        <w:spacing w:before="20" w:after="40"/>
-        <w:rPr>
-          <w:sz w:val="24"/>
-          <w:szCs w:val="24"/>
-        </w:rPr>
-      </w:pPr>
-      <w:r>
-        <w:rPr>
-          <w:b/>
-          <w:color w:val="004080"/>
-          <w:sz w:val="24"/>
-          <w:szCs w:val="24"/>
-        </w:rPr>
-        <w:t xml:space="preserve">  5. </w:t>
-      </w:r>
-      <w:r>
-        <w:rPr>
-          <w:color w:val="1A1A1A"/>
-          <w:sz w:val="24"/>
-          <w:szCs w:val="24"/>
-        </w:rPr>
-        <w:t>E-Commerce Site &amp; Marketplace Filtering</w:t>
-      </w:r>
-    </w:p>
-    <w:p>
-      <w:pPr>
-        <w:spacing w:before="20" w:after="40"/>
-        <w:rPr>
-          <w:sz w:val="24"/>
-          <w:szCs w:val="24"/>
-        </w:rPr>
-      </w:pPr>
-      <w:r>
-        <w:rPr>
-          <w:b/>
-          <w:color w:val="004080"/>
-          <w:sz w:val="24"/>
-          <w:szCs w:val="24"/>
-        </w:rPr>
-        <w:t xml:space="preserve">  6. </w:t>
-      </w:r>
-      <w:r>
-        <w:rPr>
-          <w:color w:val="1A1A1A"/>
-          <w:sz w:val="24"/>
-          <w:szCs w:val="24"/>
-        </w:rPr>
-        <w:t>Prompt Architecture &amp; AI Engine</w:t>
-      </w:r>
-    </w:p>
-    <w:p>
-      <w:pPr>
-        <w:spacing w:before="20" w:after="40"/>
-        <w:rPr>
-          <w:sz w:val="24"/>
-          <w:szCs w:val="24"/>
-        </w:rPr>
-      </w:pPr>
-      <w:r>
-        <w:rPr>
-          <w:b/>
-          <w:color w:val="004080"/>
-          <w:sz w:val="24"/>
-          <w:szCs w:val="24"/>
-        </w:rPr>
-        <w:t xml:space="preserve">  7. </w:t>
-      </w:r>
-      <w:r>
-        <w:rPr>
-          <w:color w:val="1A1A1A"/>
-          <w:sz w:val="24"/>
-          <w:szCs w:val="24"/>
-        </w:rPr>
-        <w:t>Product Classification &amp; 3-Tier Taxonomy Engine</w:t>
-      </w:r>
-    </w:p>
-    <w:p>
-      <w:pPr>
-        <w:spacing w:before="20" w:after="40"/>
-        <w:rPr>
-          <w:sz w:val="24"/>
-          <w:szCs w:val="24"/>
-        </w:rPr>
-      </w:pPr>
-      <w:r>
-        <w:rPr>
-          <w:b/>
-          <w:color w:val="004080"/>
-          <w:sz w:val="24"/>
-          <w:szCs w:val="24"/>
-        </w:rPr>
-        <w:t xml:space="preserve">  8. </w:t>
-      </w:r>
-      <w:r>
-        <w:rPr>
-          <w:color w:val="1A1A1A"/>
-          <w:sz w:val="24"/>
-          <w:szCs w:val="24"/>
-        </w:rPr>
-        <w:t>Data Model &amp; 252-Column Delivery Schema</w:t>
-      </w:r>
-    </w:p>
-    <w:p>
-      <w:pPr>
-        <w:spacing w:before="20" w:after="40"/>
-        <w:rPr>
-          <w:sz w:val="24"/>
-          <w:szCs w:val="24"/>
-        </w:rPr>
-      </w:pPr>
-      <w:r>
-        <w:rPr>
-          <w:b/>
-          <w:color w:val="004080"/>
-          <w:sz w:val="24"/>
-          <w:szCs w:val="24"/>
-        </w:rPr>
-        <w:t xml:space="preserve">  9. </w:t>
-      </w:r>
-      <w:r>
-        <w:rPr>
-          <w:color w:val="1A1A1A"/>
-          <w:sz w:val="24"/>
-          <w:szCs w:val="24"/>
-        </w:rPr>
-        <w:t>Complete Technology Stack</w:t>
-      </w:r>
-    </w:p>
-    <w:p>
-      <w:pPr>
-        <w:spacing w:before="20" w:after="40"/>
-        <w:rPr>
-          <w:sz w:val="24"/>
-          <w:szCs w:val="24"/>
-        </w:rPr>
-      </w:pPr>
-      <w:r>
-        <w:rPr>
-          <w:b/>
-          <w:color w:val="004080"/>
-          <w:sz w:val="24"/>
-          <w:szCs w:val="24"/>
-        </w:rPr>
-        <w:t xml:space="preserve">  10. </w:t>
-      </w:r>
-      <w:r>
-        <w:rPr>
-          <w:color w:val="1A1A1A"/>
-          <w:sz w:val="24"/>
-          <w:szCs w:val="24"/>
-        </w:rPr>
-        <w:t>API Inventory — External &amp; Internal</w:t>
-      </w:r>
-    </w:p>
-    <w:p>
-      <w:pPr>
-        <w:spacing w:before="20" w:after="40"/>
-        <w:rPr>
-          <w:sz w:val="24"/>
-          <w:szCs w:val="24"/>
-        </w:rPr>
-      </w:pPr>
-      <w:r>
-        <w:rPr>
-          <w:b/>
-          <w:color w:val="004080"/>
-          <w:sz w:val="24"/>
-          <w:szCs w:val="24"/>
-        </w:rPr>
-        <w:t xml:space="preserve">  11. </w:t>
-      </w:r>
-      <w:r>
-        <w:rPr>
-          <w:color w:val="1A1A1A"/>
-          <w:sz w:val="24"/>
-          <w:szCs w:val="24"/>
-        </w:rPr>
-        <w:t>Component Architecture</w:t>
-      </w:r>
-    </w:p>
-    <w:p>
-      <w:pPr>
-        <w:spacing w:before="20" w:after="40"/>
-        <w:rPr>
-          <w:sz w:val="24"/>
-          <w:szCs w:val="24"/>
-        </w:rPr>
-      </w:pPr>
-      <w:r>
-        <w:rPr>
-          <w:b/>
-          <w:color w:val="004080"/>
-          <w:sz w:val="24"/>
-          <w:szCs w:val="24"/>
-        </w:rPr>
-        <w:t xml:space="preserve">  12. </w:t>
-      </w:r>
-      <w:r>
-        <w:rPr>
-          <w:color w:val="1A1A1A"/>
-          <w:sz w:val="24"/>
-          <w:szCs w:val="24"/>
-        </w:rPr>
-        <w:t>File &amp; Module Responsibilities Map</w:t>
-      </w:r>
-    </w:p>
-    <w:p>
-      <w:pPr>
-        <w:spacing w:before="20" w:after="40"/>
-        <w:rPr>
-          <w:sz w:val="24"/>
-          <w:szCs w:val="24"/>
-        </w:rPr>
-      </w:pPr>
-      <w:r>
-        <w:rPr>
-          <w:b/>
-          <w:color w:val="004080"/>
-          <w:sz w:val="24"/>
-          <w:szCs w:val="24"/>
-        </w:rPr>
-        <w:t xml:space="preserve">  13. </w:t>
-      </w:r>
-      <w:r>
-        <w:rPr>
-          <w:color w:val="1A1A1A"/>
-          <w:sz w:val="24"/>
-          <w:szCs w:val="24"/>
-        </w:rPr>
-        <w:t>End-to-End Product Lifecycle Walkthrough</w:t>
-      </w:r>
-    </w:p>
-    <w:p>
-      <w:pPr>
-        <w:spacing w:before="20" w:after="40"/>
-        <w:rPr>
-          <w:sz w:val="24"/>
-          <w:szCs w:val="24"/>
-        </w:rPr>
-      </w:pPr>
-      <w:r>
-        <w:rPr>
-          <w:b/>
-          <w:color w:val="004080"/>
-          <w:sz w:val="24"/>
-          <w:szCs w:val="24"/>
-        </w:rPr>
-        <w:t xml:space="preserve">  14. </w:t>
-      </w:r>
-      <w:r>
-        <w:rPr>
-          <w:color w:val="1A1A1A"/>
-          <w:sz w:val="24"/>
-          <w:szCs w:val="24"/>
-        </w:rPr>
-        <w:t>Error Handling, Fallbacks &amp; Validation Guardrails</w:t>
-      </w:r>
-    </w:p>
-    <w:p>
-      <w:pPr>
-        <w:spacing w:before="20" w:after="40"/>
-        <w:rPr>
-          <w:sz w:val="24"/>
-          <w:szCs w:val="24"/>
-        </w:rPr>
-      </w:pPr>
-      <w:r>
-        <w:rPr>
-          <w:b/>
-          <w:color w:val="004080"/>
-          <w:sz w:val="24"/>
-          <w:szCs w:val="24"/>
-        </w:rPr>
-        <w:t xml:space="preserve">  15. </w:t>
-      </w:r>
-      <w:r>
-        <w:rPr>
-          <w:color w:val="1A1A1A"/>
-          <w:sz w:val="24"/>
-          <w:szCs w:val="24"/>
-        </w:rPr>
-        <w:t>Scalability Architecture</w:t>
-      </w:r>
-    </w:p>
-    <w:p>
-      <w:pPr>
-        <w:spacing w:before="20" w:after="40"/>
-        <w:rPr>
-          <w:sz w:val="24"/>
-          <w:szCs w:val="24"/>
-        </w:rPr>
-      </w:pPr>
-      <w:r>
-        <w:rPr>
-          <w:b/>
-          <w:color w:val="004080"/>
-          <w:sz w:val="24"/>
-          <w:szCs w:val="24"/>
-        </w:rPr>
-        <w:t xml:space="preserve">  16. </w:t>
-      </w:r>
-      <w:r>
-        <w:rPr>
-          <w:color w:val="1A1A1A"/>
-          <w:sz w:val="24"/>
-          <w:szCs w:val="24"/>
-        </w:rPr>
-        <w:t>Why CatalogForge Is Unique</w:t>
-      </w:r>
-    </w:p>
-    <w:p>
-      <w:pPr>
-        <w:spacing w:before="20" w:after="40"/>
-        <w:rPr>
-          <w:sz w:val="24"/>
-          <w:szCs w:val="24"/>
-        </w:rPr>
-      </w:pPr>
-      <w:r>
-        <w:rPr>
-          <w:b/>
-          <w:color w:val="004080"/>
-          <w:sz w:val="24"/>
-          <w:szCs w:val="24"/>
-        </w:rPr>
-        <w:t xml:space="preserve">  17. </w:t>
-      </w:r>
-      <w:r>
-        <w:rPr>
-          <w:color w:val="1A1A1A"/>
-          <w:sz w:val="24"/>
-          <w:szCs w:val="24"/>
-        </w:rPr>
-        <w:t>Production Readiness Assessment</w:t>
-      </w:r>
-    </w:p>
-    <w:p>
-      <w:pPr>
-        <w:spacing w:before="20" w:after="40"/>
-        <w:rPr>
-          <w:sz w:val="24"/>
-          <w:szCs w:val="24"/>
-        </w:rPr>
-      </w:pPr>
-      <w:r>
-        <w:rPr>
-          <w:b/>
-          <w:color w:val="004080"/>
-          <w:sz w:val="24"/>
-          <w:szCs w:val="24"/>
-        </w:rPr>
-        <w:t xml:space="preserve">  18. </w:t>
-      </w:r>
-      <w:r>
-        <w:rPr>
-          <w:color w:val="1A1A1A"/>
-          <w:sz w:val="24"/>
-          <w:szCs w:val="24"/>
-        </w:rPr>
-        <w:t>Business Value &amp; Economic Impact</w:t>
-      </w:r>
-    </w:p>
-    <w:p>
-      <w:pPr>
-        <w:spacing w:before="20" w:after="40"/>
-        <w:rPr>
-          <w:sz w:val="24"/>
-          <w:szCs w:val="24"/>
-        </w:rPr>
-      </w:pPr>
-      <w:r>
-        <w:rPr>
-          <w:b/>
-          <w:color w:val="004080"/>
-          <w:sz w:val="24"/>
-          <w:szCs w:val="24"/>
-        </w:rPr>
-        <w:t xml:space="preserve">  19. </w:t>
-      </w:r>
-      <w:r>
-        <w:rPr>
-          <w:color w:val="1A1A1A"/>
-          <w:sz w:val="24"/>
-          <w:szCs w:val="24"/>
-        </w:rPr>
-        <w:t>ROI Metrics &amp; Suggested Production KPIs</w:t>
-      </w:r>
-    </w:p>
-    <w:p>
-      <w:pPr>
-        <w:spacing w:before="20" w:after="40"/>
-        <w:rPr>
-          <w:sz w:val="24"/>
-          <w:szCs w:val="24"/>
-        </w:rPr>
-      </w:pPr>
-      <w:r>
-        <w:rPr>
-          <w:b/>
-          <w:color w:val="004080"/>
-          <w:sz w:val="24"/>
-          <w:szCs w:val="24"/>
-        </w:rPr>
-        <w:t xml:space="preserve">  20. </w:t>
-      </w:r>
-      <w:r>
-        <w:rPr>
-          <w:color w:val="1A1A1A"/>
-          <w:sz w:val="24"/>
-          <w:szCs w:val="24"/>
-        </w:rPr>
-        <w:t>Security, Authentication &amp; Data Privacy</w:t>
-      </w:r>
-    </w:p>
-    <w:p>
-      <w:pPr>
-        <w:spacing w:before="20" w:after="40"/>
-        <w:rPr>
-          <w:sz w:val="24"/>
-          <w:szCs w:val="24"/>
-        </w:rPr>
-      </w:pPr>
-      <w:r>
-        <w:rPr>
-          <w:b/>
-          <w:color w:val="004080"/>
-          <w:sz w:val="24"/>
-          <w:szCs w:val="24"/>
-        </w:rPr>
-        <w:t xml:space="preserve">  21. </w:t>
-      </w:r>
-      <w:r>
-        <w:rPr>
-          <w:color w:val="1A1A1A"/>
-          <w:sz w:val="24"/>
-          <w:szCs w:val="24"/>
-        </w:rPr>
-        <w:t>Performance Optimization &amp; Latency Control</w:t>
-      </w:r>
-    </w:p>
-    <w:p>
-      <w:pPr>
-        <w:spacing w:before="20" w:after="40"/>
-        <w:rPr>
-          <w:sz w:val="24"/>
-          <w:szCs w:val="24"/>
-        </w:rPr>
-      </w:pPr>
-      <w:r>
-        <w:rPr>
-          <w:b/>
-          <w:color w:val="004080"/>
-          <w:sz w:val="24"/>
-          <w:szCs w:val="24"/>
-        </w:rPr>
-        <w:t xml:space="preserve">  22. </w:t>
-      </w:r>
-      <w:r>
-        <w:rPr>
-          <w:color w:val="1A1A1A"/>
-          <w:sz w:val="24"/>
-          <w:szCs w:val="24"/>
-        </w:rPr>
-        <w:t>Monitoring, Observability &amp; Telemetry</w:t>
-      </w:r>
-    </w:p>
-    <w:p>
-      <w:pPr>
-        <w:spacing w:before="20" w:after="40"/>
-        <w:rPr>
-          <w:sz w:val="24"/>
-          <w:szCs w:val="24"/>
-        </w:rPr>
-      </w:pPr>
-      <w:r>
-        <w:rPr>
-          <w:b/>
-          <w:color w:val="004080"/>
-          <w:sz w:val="24"/>
-          <w:szCs w:val="24"/>
-        </w:rPr>
-        <w:t xml:space="preserve">  23. </w:t>
-      </w:r>
-      <w:r>
-        <w:rPr>
-          <w:color w:val="1A1A1A"/>
-          <w:sz w:val="24"/>
-          <w:szCs w:val="24"/>
-        </w:rPr>
-        <w:t>Deployment Architecture</w:t>
-      </w:r>
-    </w:p>
-    <w:p>
-      <w:pPr>
-        <w:spacing w:before="20" w:after="40"/>
-        <w:rPr>
-          <w:sz w:val="24"/>
-          <w:szCs w:val="24"/>
-        </w:rPr>
-      </w:pPr>
-      <w:r>
-        <w:rPr>
-          <w:b/>
-          <w:color w:val="004080"/>
-          <w:sz w:val="24"/>
-          <w:szCs w:val="24"/>
-        </w:rPr>
-        <w:t xml:space="preserve">  24. </w:t>
-      </w:r>
-      <w:r>
-        <w:rPr>
-          <w:color w:val="1A1A1A"/>
-          <w:sz w:val="24"/>
-          <w:szCs w:val="24"/>
-        </w:rPr>
-        <w:t>Judge-Focused Defense Guide — 19 Viva Q&amp;A</w:t>
-      </w:r>
-    </w:p>
-    <w:p>
-      <w:pPr>
-        <w:spacing w:before="20" w:after="40"/>
-        <w:rPr>
-          <w:sz w:val="24"/>
-          <w:szCs w:val="24"/>
-        </w:rPr>
-      </w:pPr>
-      <w:r>
-        <w:rPr>
-          <w:b/>
-          <w:color w:val="004080"/>
-          <w:sz w:val="24"/>
-          <w:szCs w:val="24"/>
-        </w:rPr>
-        <w:t xml:space="preserve">  25. </w:t>
-      </w:r>
-      <w:r>
-        <w:rPr>
-          <w:color w:val="1A1A1A"/>
-          <w:sz w:val="24"/>
-          <w:szCs w:val="24"/>
-        </w:rPr>
-        <w:t>Index of Core Technical Diagrams</w:t>
-      </w:r>
-    </w:p>
-    <w:p>
-      <w:pPr>
-        <w:spacing w:before="20" w:after="40"/>
-        <w:rPr>
-          <w:sz w:val="24"/>
-          <w:szCs w:val="24"/>
-        </w:rPr>
-      </w:pPr>
-      <w:r>
-        <w:rPr>
-          <w:b/>
-          <w:color w:val="004080"/>
-          <w:sz w:val="24"/>
-          <w:szCs w:val="24"/>
-        </w:rPr>
-        <w:t xml:space="preserve">  26. </w:t>
-      </w:r>
-      <w:r>
-        <w:rPr>
-          <w:color w:val="1A1A1A"/>
-          <w:sz w:val="24"/>
-          <w:szCs w:val="24"/>
-        </w:rPr>
-        <w:t>Architecture Summary</w:t>
-      </w:r>
-    </w:p>
-    <w:p>
-      <w:pPr>
-        <w:spacing w:before="20" w:after="40"/>
-        <w:rPr>
-          <w:sz w:val="24"/>
-          <w:szCs w:val="24"/>
-        </w:rPr>
-      </w:pPr>
-      <w:r>
-        <w:rPr>
-          <w:b/>
-          <w:color w:val="004080"/>
-          <w:sz w:val="24"/>
-          <w:szCs w:val="24"/>
-        </w:rPr>
-        <w:t xml:space="preserve">  27. </w:t>
-      </w:r>
-      <w:r>
-        <w:rPr>
-          <w:color w:val="1A1A1A"/>
-          <w:sz w:val="24"/>
-          <w:szCs w:val="24"/>
-        </w:rPr>
-        <w:t>Current System Limitations</w:t>
-      </w:r>
-    </w:p>
-    <w:p>
-      <w:pPr>
-        <w:spacing w:before="20" w:after="40"/>
-        <w:rPr>
-          <w:sz w:val="24"/>
-          <w:szCs w:val="24"/>
-        </w:rPr>
-      </w:pPr>
-      <w:r>
-        <w:rPr>
-          <w:b/>
-          <w:color w:val="004080"/>
-          <w:sz w:val="24"/>
-          <w:szCs w:val="24"/>
-        </w:rPr>
-        <w:t xml:space="preserve">  28. </w:t>
-      </w:r>
-      <w:r>
-        <w:rPr>
-          <w:color w:val="1A1A1A"/>
-          <w:sz w:val="24"/>
-          <w:szCs w:val="24"/>
-        </w:rPr>
-        <w:t>Future Scope &amp; Roadmap</w:t>
-      </w:r>
-    </w:p>
-    <w:p>
-      <w:pPr>
-        <w:spacing w:before="20" w:after="40"/>
-        <w:rPr>
-          <w:sz w:val="24"/>
-          <w:szCs w:val="24"/>
-        </w:rPr>
-      </w:pPr>
-      <w:r>
-        <w:rPr>
-          <w:b/>
-          <w:color w:val="004080"/>
-          <w:sz w:val="24"/>
-          <w:szCs w:val="24"/>
-        </w:rPr>
-        <w:t xml:space="preserve">  29. </w:t>
-      </w:r>
-      <w:r>
-        <w:rPr>
-          <w:color w:val="1A1A1A"/>
-          <w:sz w:val="24"/>
-          <w:szCs w:val="24"/>
-        </w:rPr>
-        <w:t>Final Project Summary</w:t>
-      </w:r>
-    </w:p>
-    <w:p>
-      <w:pPr>
-        <w:rPr>
-          <w:sz w:val="24"/>
-          <w:szCs w:val="24"/>
-        </w:rPr>
-      </w:pPr>
-      <w:r>
-        <w:rPr>
-          <w:sz w:val="24"/>
-          <w:szCs w:val="24"/>
-        </w:rPr>
-        <w:br w:type="page"/>
-      </w:r>
     </w:p>
     <w:p>
       <w:pPr>
@@ -5261,6 +4556,36 @@
     <w:p>
       <w:pPr>
         <w:spacing w:before="200" w:after="80"/>
+        <w:rPr>
+          <w:b/>
+          <w:color w:val="0F6FD4"/>
+          <w:sz w:val="24"/>
+        </w:rPr>
+      </w:pPr>
+    </w:p>
+    <w:p>
+      <w:pPr>
+        <w:spacing w:before="200" w:after="80"/>
+        <w:rPr>
+          <w:b/>
+          <w:color w:val="0F6FD4"/>
+          <w:sz w:val="24"/>
+        </w:rPr>
+      </w:pPr>
+    </w:p>
+    <w:p>
+      <w:pPr>
+        <w:spacing w:before="200" w:after="80"/>
+        <w:rPr>
+          <w:b/>
+          <w:color w:val="0F6FD4"/>
+          <w:sz w:val="24"/>
+        </w:rPr>
+      </w:pPr>
+    </w:p>
+    <w:p>
+      <w:pPr>
+        <w:spacing w:before="200" w:after="80"/>
       </w:pPr>
       <w:r>
         <w:rPr>
@@ -5268,6 +4593,7 @@
           <w:color w:val="0F6FD4"/>
           <w:sz w:val="24"/>
         </w:rPr>
+        <w:lastRenderedPageBreak/>
         <w:t>Source Governance Tier Flow</w:t>
       </w:r>
     </w:p>
@@ -5343,7 +4669,6 @@
           <w:color w:val="004080"/>
           <w:sz w:val="28"/>
         </w:rPr>
-        <w:lastRenderedPageBreak/>
         <w:t>↓</w:t>
       </w:r>
     </w:p>
@@ -6295,7 +5620,6 @@
         <w:rPr>
           <w:color w:val="1A1A1A"/>
         </w:rPr>
-        <w:lastRenderedPageBreak/>
         <w:t>•  Unilog Title Formula:  Brand + [Series] + MPN + Item Type + [Key Attributes]  (≤ 150 chars)</w:t>
       </w:r>
     </w:p>
@@ -6733,6 +6057,7 @@
           <w:b/>
           <w:color w:val="004080"/>
         </w:rPr>
+        <w:lastRenderedPageBreak/>
         <w:t>3-Tier Merchandise Taxonomy Hierarchy</w:t>
       </w:r>
     </w:p>
@@ -6935,7 +6260,6 @@
                 <w:color w:val="FFFFFF"/>
                 <w:sz w:val="19"/>
               </w:rPr>
-              <w:lastRenderedPageBreak/>
               <w:t>FINE (Fineline)</w:t>
             </w:r>
           </w:p>
@@ -8396,6 +7720,7 @@
                 <w:color w:val="1A1A1A"/>
                 <w:sz w:val="18"/>
               </w:rPr>
+              <w:lastRenderedPageBreak/>
               <w:t>Abrasive Belts</w:t>
             </w:r>
           </w:p>
@@ -8670,15 +7995,7 @@
                 <w:color w:val="1A1A1A"/>
                 <w:sz w:val="18"/>
               </w:rPr>
-              <w:t xml:space="preserve">cut-off disc, grinding disc, </w:t>
-            </w:r>
-            <w:r>
-              <w:rPr>
-                <w:color w:val="1A1A1A"/>
-                <w:sz w:val="18"/>
-              </w:rPr>
-              <w:lastRenderedPageBreak/>
-              <w:t>flap disc</w:t>
+              <w:t>cut-off disc, grinding disc, flap disc</w:t>
             </w:r>
           </w:p>
         </w:tc>
@@ -8702,7 +8019,6 @@
                 <w:color w:val="1A1A1A"/>
                 <w:sz w:val="18"/>
               </w:rPr>
-              <w:lastRenderedPageBreak/>
               <w:t>abrasives</w:t>
             </w:r>
           </w:p>
@@ -8727,15 +8043,7 @@
                 <w:color w:val="1A1A1A"/>
                 <w:sz w:val="18"/>
               </w:rPr>
-              <w:t xml:space="preserve">cutting &amp; grinding </w:t>
-            </w:r>
-            <w:r>
-              <w:rPr>
-                <w:color w:val="1A1A1A"/>
-                <w:sz w:val="18"/>
-              </w:rPr>
-              <w:lastRenderedPageBreak/>
-              <w:t>wheels</w:t>
+              <w:t>cutting &amp; grinding wheels</w:t>
             </w:r>
           </w:p>
         </w:tc>
@@ -8759,7 +8067,6 @@
                 <w:color w:val="1A1A1A"/>
                 <w:sz w:val="18"/>
               </w:rPr>
-              <w:lastRenderedPageBreak/>
               <w:t>cut-off discs</w:t>
             </w:r>
           </w:p>
@@ -10770,6 +10077,7 @@
                 <w:color w:val="1A1A1A"/>
                 <w:sz w:val="18"/>
               </w:rPr>
+              <w:lastRenderedPageBreak/>
               <w:t>Columns 215–224</w:t>
             </w:r>
           </w:p>
@@ -11683,6 +10991,13 @@
           <w:sz w:val="18"/>
         </w:rPr>
         <w:br/>
+      </w:r>
+      <w:r>
+        <w:rPr>
+          <w:color w:val="1A1A2E"/>
+          <w:sz w:val="18"/>
+        </w:rPr>
+        <w:lastRenderedPageBreak/>
         <w:t xml:space="preserve">  "completenessRate": 92</w:t>
       </w:r>
       <w:r>
@@ -13816,7 +13131,15 @@
                 <w:color w:val="1A1A1A"/>
                 <w:sz w:val="18"/>
               </w:rPr>
-              <w:t>SheetJS (xlsx) + csv-parse</w:t>
+              <w:t>SheetJS (xlsx) + csv-</w:t>
+            </w:r>
+            <w:r>
+              <w:rPr>
+                <w:color w:val="1A1A1A"/>
+                <w:sz w:val="18"/>
+              </w:rPr>
+              <w:lastRenderedPageBreak/>
+              <w:t>parse</w:t>
             </w:r>
           </w:p>
         </w:tc>
@@ -13840,6 +13163,7 @@
                 <w:color w:val="1A1A1A"/>
                 <w:sz w:val="18"/>
               </w:rPr>
+              <w:lastRenderedPageBreak/>
               <w:t>0.18.5/5.5</w:t>
             </w:r>
           </w:p>
@@ -13864,7 +13188,15 @@
                 <w:color w:val="1A1A1A"/>
                 <w:sz w:val="18"/>
               </w:rPr>
-              <w:t>Parsing uploaded sheets, compiling 252-col delivery workbook</w:t>
+              <w:t xml:space="preserve">Parsing uploaded sheets, </w:t>
+            </w:r>
+            <w:r>
+              <w:rPr>
+                <w:color w:val="1A1A1A"/>
+                <w:sz w:val="18"/>
+              </w:rPr>
+              <w:lastRenderedPageBreak/>
+              <w:t>compiling 252-col delivery workbook</w:t>
             </w:r>
           </w:p>
         </w:tc>
@@ -13888,7 +13220,16 @@
                 <w:color w:val="1A1A1A"/>
                 <w:sz w:val="18"/>
               </w:rPr>
-              <w:t>delivery-exporter.service.ts</w:t>
+              <w:lastRenderedPageBreak/>
+              <w:t>delivery-</w:t>
+            </w:r>
+            <w:r>
+              <w:rPr>
+                <w:color w:val="1A1A1A"/>
+                <w:sz w:val="18"/>
+              </w:rPr>
+              <w:lastRenderedPageBreak/>
+              <w:t>exporter.service.ts</w:t>
             </w:r>
           </w:p>
         </w:tc>
@@ -13917,6 +13258,7 @@
                 <w:color w:val="1A1A1A"/>
                 <w:sz w:val="18"/>
               </w:rPr>
+              <w:lastRenderedPageBreak/>
               <w:t>PDF Extraction</w:t>
             </w:r>
           </w:p>
@@ -14292,7 +13634,6 @@
                 <w:color w:val="1A1A1A"/>
                 <w:sz w:val="18"/>
               </w:rPr>
-              <w:lastRenderedPageBreak/>
               <w:t>API Documentation</w:t>
             </w:r>
           </w:p>
@@ -15936,6 +15277,7 @@
                 <w:color w:val="1A1A1A"/>
                 <w:sz w:val="18"/>
               </w:rPr>
+              <w:lastRenderedPageBreak/>
               <w:t>POST</w:t>
             </w:r>
           </w:p>
@@ -16441,7 +15783,6 @@
                 <w:color w:val="1A1A1A"/>
                 <w:sz w:val="18"/>
               </w:rPr>
-              <w:lastRenderedPageBreak/>
               <w:t>GET</w:t>
             </w:r>
           </w:p>
@@ -18111,6 +17452,19 @@
           <w:bottom w:val="single" w:sz="12" w:space="4" w:color="0B244A"/>
         </w:pBdr>
         <w:spacing w:before="360"/>
+        <w:rPr>
+          <w:b/>
+          <w:color w:val="0B244A"/>
+          <w:sz w:val="40"/>
+        </w:rPr>
+      </w:pPr>
+    </w:p>
+    <w:p>
+      <w:pPr>
+        <w:pBdr>
+          <w:bottom w:val="single" w:sz="12" w:space="4" w:color="0B244A"/>
+        </w:pBdr>
+        <w:spacing w:before="360"/>
       </w:pPr>
       <w:r>
         <w:rPr>
@@ -18118,6 +17472,7 @@
           <w:color w:val="0B244A"/>
           <w:sz w:val="40"/>
         </w:rPr>
+        <w:lastRenderedPageBreak/>
         <w:t>12. File &amp; Module Responsibilities Map</w:t>
       </w:r>
     </w:p>
@@ -18330,7 +17685,6 @@
                 <w:color w:val="1A1A1A"/>
                 <w:sz w:val="18"/>
               </w:rPr>
-              <w:lastRenderedPageBreak/>
               <w:t>batch-file-enricher.service.ts</w:t>
             </w:r>
           </w:p>
@@ -19531,6 +18885,16 @@
     <w:p>
       <w:pPr>
         <w:spacing w:before="280" w:after="120"/>
+        <w:rPr>
+          <w:b/>
+          <w:color w:val="004080"/>
+          <w:sz w:val="30"/>
+        </w:rPr>
+      </w:pPr>
+    </w:p>
+    <w:p>
+      <w:pPr>
+        <w:spacing w:before="280" w:after="120"/>
       </w:pPr>
       <w:r>
         <w:rPr>
@@ -19538,6 +18902,7 @@
           <w:color w:val="004080"/>
           <w:sz w:val="30"/>
         </w:rPr>
+        <w:lastRenderedPageBreak/>
         <w:t>Frontend Core (src/lib/ &amp; src/app/)</w:t>
       </w:r>
     </w:p>
@@ -19792,7 +19157,6 @@
                 <w:color w:val="1A1A1A"/>
                 <w:sz w:val="18"/>
               </w:rPr>
-              <w:lastRenderedPageBreak/>
               <w:t>src/app/(app)/products/page.tsx</w:t>
             </w:r>
           </w:p>
@@ -19883,19 +19247,6 @@
           <w:bottom w:val="single" w:sz="6" w:space="1" w:color="B0C4DE"/>
         </w:pBdr>
         <w:spacing w:before="40" w:after="40"/>
-      </w:pPr>
-    </w:p>
-    <w:p>
-      <w:pPr>
-        <w:pBdr>
-          <w:bottom w:val="single" w:sz="12" w:space="4" w:color="0B244A"/>
-        </w:pBdr>
-        <w:spacing w:before="360"/>
-        <w:rPr>
-          <w:b/>
-          <w:color w:val="0B244A"/>
-          <w:sz w:val="40"/>
-        </w:rPr>
       </w:pPr>
     </w:p>
     <w:p>
@@ -20249,6 +19600,13 @@
                 <w:sz w:val="20"/>
               </w:rPr>
               <w:br/>
+            </w:r>
+            <w:r>
+              <w:rPr>
+                <w:color w:val="FFFFFF"/>
+                <w:sz w:val="20"/>
+              </w:rPr>
+              <w:lastRenderedPageBreak/>
               <w:t>Width: 23-7/8 in (Confidence: 0.99)  |  Height: 33-5/8 in (0.98)</w:t>
             </w:r>
             <w:r>
@@ -20290,6 +19648,7 @@
           <w:color w:val="004080"/>
           <w:sz w:val="28"/>
         </w:rPr>
+        <w:lastRenderedPageBreak/>
         <w:t>↓</w:t>
       </w:r>
     </w:p>
@@ -20333,7 +19692,6 @@
                 <w:color w:val="FFFFFF"/>
                 <w:sz w:val="20"/>
               </w:rPr>
-              <w:lastRenderedPageBreak/>
               <w:t>STEP 4 — TAXONOMY RESOLUTION ENGINE</w:t>
             </w:r>
             <w:r>
@@ -21135,7 +20493,15 @@
                 <w:color w:val="1A1A1A"/>
                 <w:sz w:val="18"/>
               </w:rPr>
-              <w:t>Offline DB Fallback</w:t>
+              <w:t xml:space="preserve">Offline DB </w:t>
+            </w:r>
+            <w:r>
+              <w:rPr>
+                <w:color w:val="1A1A1A"/>
+                <w:sz w:val="18"/>
+              </w:rPr>
+              <w:lastRenderedPageBreak/>
+              <w:t>Fallback</w:t>
             </w:r>
           </w:p>
         </w:tc>
@@ -21153,7 +20519,16 @@
                 <w:color w:val="1A1A1A"/>
                 <w:sz w:val="18"/>
               </w:rPr>
-              <w:t>In-memory Map stores records if Azure SQL is unlinked or unreachable</w:t>
+              <w:lastRenderedPageBreak/>
+              <w:t xml:space="preserve">In-memory Map stores records if </w:t>
+            </w:r>
+            <w:r>
+              <w:rPr>
+                <w:color w:val="1A1A1A"/>
+                <w:sz w:val="18"/>
+              </w:rPr>
+              <w:lastRenderedPageBreak/>
+              <w:t>Azure SQL is unlinked or unreachable</w:t>
             </w:r>
           </w:p>
         </w:tc>
@@ -21171,6 +20546,7 @@
                 <w:color w:val="1A1A1A"/>
                 <w:sz w:val="18"/>
               </w:rPr>
+              <w:lastRenderedPageBreak/>
               <w:t>product.repository.ts</w:t>
             </w:r>
           </w:p>
@@ -21288,7 +20664,6 @@
           <w:color w:val="004080"/>
           <w:sz w:val="20"/>
         </w:rPr>
-        <w:lastRenderedPageBreak/>
         <w:t>[ Fault-Tolerant Fallback &amp; Resilience Flow ]</w:t>
       </w:r>
     </w:p>
@@ -21731,6 +21106,26 @@
     <w:p>
       <w:pPr>
         <w:spacing w:before="280" w:after="120"/>
+        <w:rPr>
+          <w:b/>
+          <w:color w:val="004080"/>
+          <w:sz w:val="30"/>
+        </w:rPr>
+      </w:pPr>
+    </w:p>
+    <w:p>
+      <w:pPr>
+        <w:spacing w:before="280" w:after="120"/>
+        <w:rPr>
+          <w:b/>
+          <w:color w:val="004080"/>
+          <w:sz w:val="30"/>
+        </w:rPr>
+      </w:pPr>
+    </w:p>
+    <w:p>
+      <w:pPr>
+        <w:spacing w:before="280" w:after="120"/>
       </w:pPr>
       <w:r>
         <w:rPr>
@@ -21738,6 +21133,7 @@
           <w:color w:val="004080"/>
           <w:sz w:val="30"/>
         </w:rPr>
+        <w:lastRenderedPageBreak/>
         <w:t>Future Scalability Roadmap (Planned)</w:t>
       </w:r>
     </w:p>
@@ -22063,7 +21459,6 @@
                 <w:color w:val="FFFFFF"/>
                 <w:sz w:val="17"/>
               </w:rPr>
-              <w:lastRenderedPageBreak/>
               <w:t>In-Memory URL Cache</w:t>
             </w:r>
             <w:r>
@@ -22295,45 +21690,6 @@
           <w:bottom w:val="single" w:sz="6" w:space="1" w:color="B0C4DE"/>
         </w:pBdr>
         <w:spacing w:before="40" w:after="40"/>
-      </w:pPr>
-    </w:p>
-    <w:p>
-      <w:pPr>
-        <w:pBdr>
-          <w:bottom w:val="single" w:sz="12" w:space="4" w:color="0B244A"/>
-        </w:pBdr>
-        <w:spacing w:before="360"/>
-        <w:rPr>
-          <w:b/>
-          <w:color w:val="0B244A"/>
-          <w:sz w:val="40"/>
-        </w:rPr>
-      </w:pPr>
-    </w:p>
-    <w:p>
-      <w:pPr>
-        <w:pBdr>
-          <w:bottom w:val="single" w:sz="12" w:space="4" w:color="0B244A"/>
-        </w:pBdr>
-        <w:spacing w:before="360"/>
-        <w:rPr>
-          <w:b/>
-          <w:color w:val="0B244A"/>
-          <w:sz w:val="40"/>
-        </w:rPr>
-      </w:pPr>
-    </w:p>
-    <w:p>
-      <w:pPr>
-        <w:pBdr>
-          <w:bottom w:val="single" w:sz="12" w:space="4" w:color="0B244A"/>
-        </w:pBdr>
-        <w:spacing w:before="360"/>
-        <w:rPr>
-          <w:b/>
-          <w:color w:val="0B244A"/>
-          <w:sz w:val="40"/>
-        </w:rPr>
       </w:pPr>
     </w:p>
     <w:p>
@@ -23298,6 +22654,19 @@
           <w:bottom w:val="single" w:sz="12" w:space="4" w:color="0B244A"/>
         </w:pBdr>
         <w:spacing w:before="360"/>
+        <w:rPr>
+          <w:b/>
+          <w:color w:val="0B244A"/>
+          <w:sz w:val="40"/>
+        </w:rPr>
+      </w:pPr>
+    </w:p>
+    <w:p>
+      <w:pPr>
+        <w:pBdr>
+          <w:bottom w:val="single" w:sz="12" w:space="4" w:color="0B244A"/>
+        </w:pBdr>
+        <w:spacing w:before="360"/>
       </w:pPr>
       <w:r>
         <w:rPr>
@@ -23305,6 +22674,7 @@
           <w:color w:val="0B244A"/>
           <w:sz w:val="40"/>
         </w:rPr>
+        <w:lastRenderedPageBreak/>
         <w:t>17. Production Readiness Assessment</w:t>
       </w:r>
     </w:p>
@@ -23341,7 +22711,6 @@
                 <w:color w:val="FFFFFF"/>
                 <w:sz w:val="19"/>
               </w:rPr>
-              <w:lastRenderedPageBreak/>
               <w:t>Dimension</w:t>
             </w:r>
           </w:p>
@@ -24516,6 +23885,7 @@
         <w:rPr>
           <w:color w:val="1A1A1A"/>
         </w:rPr>
+        <w:lastRenderedPageBreak/>
         <w:t>•  98%+ Reduction in Cost Per SKU: Replaces $15–$25 manual data-entry labor with $0.02–$0.05 automated API compute.</w:t>
       </w:r>
     </w:p>
@@ -24528,7 +23898,6 @@
         <w:rPr>
           <w:color w:val="1A1A1A"/>
         </w:rPr>
-        <w:lastRenderedPageBreak/>
         <w:t>•  Zero-Hallucination Compliance: Protects distributors from multimillion-dollar supply chain liabilities caused by AI-invented dimensions or voltages.</w:t>
       </w:r>
     </w:p>
@@ -25218,6 +24587,16 @@
     <w:p>
       <w:pPr>
         <w:spacing w:before="200" w:after="80"/>
+        <w:rPr>
+          <w:b/>
+          <w:color w:val="0F6FD4"/>
+          <w:sz w:val="24"/>
+        </w:rPr>
+      </w:pPr>
+    </w:p>
+    <w:p>
+      <w:pPr>
+        <w:spacing w:before="200" w:after="80"/>
       </w:pPr>
       <w:r>
         <w:rPr>
@@ -25225,6 +24604,7 @@
           <w:color w:val="0F6FD4"/>
           <w:sz w:val="24"/>
         </w:rPr>
+        <w:lastRenderedPageBreak/>
         <w:t>Planned Enterprise Security Enhancements</w:t>
       </w:r>
     </w:p>
@@ -25249,7 +24629,6 @@
         <w:rPr>
           <w:color w:val="1A1A1A"/>
         </w:rPr>
-        <w:lastRenderedPageBreak/>
         <w:t>•  Data-at-rest field encryption for proprietary pricing catalogs.</w:t>
       </w:r>
     </w:p>
@@ -25453,6 +24832,32 @@
           <w:bottom w:val="single" w:sz="12" w:space="4" w:color="0B244A"/>
         </w:pBdr>
         <w:spacing w:before="360"/>
+        <w:rPr>
+          <w:b/>
+          <w:color w:val="0B244A"/>
+          <w:sz w:val="40"/>
+        </w:rPr>
+      </w:pPr>
+    </w:p>
+    <w:p>
+      <w:pPr>
+        <w:pBdr>
+          <w:bottom w:val="single" w:sz="12" w:space="4" w:color="0B244A"/>
+        </w:pBdr>
+        <w:spacing w:before="360"/>
+        <w:rPr>
+          <w:b/>
+          <w:color w:val="0B244A"/>
+          <w:sz w:val="40"/>
+        </w:rPr>
+      </w:pPr>
+    </w:p>
+    <w:p>
+      <w:pPr>
+        <w:pBdr>
+          <w:bottom w:val="single" w:sz="12" w:space="4" w:color="0B244A"/>
+        </w:pBdr>
+        <w:spacing w:before="360"/>
       </w:pPr>
       <w:r>
         <w:rPr>
@@ -25460,6 +24865,7 @@
           <w:color w:val="0B244A"/>
           <w:sz w:val="40"/>
         </w:rPr>
+        <w:lastRenderedPageBreak/>
         <w:t>23. Deployment Architecture</w:t>
       </w:r>
     </w:p>
@@ -25578,7 +24984,6 @@
                 <w:color w:val="FFFFFF"/>
                 <w:sz w:val="20"/>
               </w:rPr>
-              <w:lastRenderedPageBreak/>
               <w:t>VERCEL EDGE NETWORK  —  Next.js 15 App Router Frontend</w:t>
             </w:r>
           </w:p>
@@ -26591,2729 +25996,6 @@
       </w:tr>
     </w:tbl>
     <w:p/>
-    <w:p>
-      <w:pPr>
-        <w:pBdr>
-          <w:bottom w:val="single" w:sz="6" w:space="1" w:color="B0C4DE"/>
-        </w:pBdr>
-        <w:spacing w:before="40" w:after="40"/>
-      </w:pPr>
-    </w:p>
-    <w:p>
-      <w:pPr>
-        <w:pBdr>
-          <w:bottom w:val="single" w:sz="12" w:space="4" w:color="0B244A"/>
-        </w:pBdr>
-        <w:spacing w:before="360"/>
-      </w:pPr>
-      <w:r>
-        <w:rPr>
-          <w:b/>
-          <w:color w:val="0B244A"/>
-          <w:sz w:val="40"/>
-        </w:rPr>
-        <w:t>24. Judge-Focused Defense Guide — 19 Viva Questions &amp; Answers</w:t>
-      </w:r>
-    </w:p>
-    <w:tbl>
-      <w:tblPr>
-        <w:tblW w:w="0" w:type="auto"/>
-        <w:jc w:val="center"/>
-        <w:tblLook w:val="04A0" w:firstRow="1" w:lastRow="0" w:firstColumn="1" w:lastColumn="0" w:noHBand="0" w:noVBand="1"/>
-      </w:tblPr>
-      <w:tblGrid>
-        <w:gridCol w:w="9360"/>
-      </w:tblGrid>
-      <w:tr>
-        <w:trPr>
-          <w:jc w:val="center"/>
-        </w:trPr>
-        <w:tc>
-          <w:tcPr>
-            <w:tcW w:w="9360" w:type="dxa"/>
-            <w:tcBorders>
-              <w:top w:val="single" w:sz="12" w:space="0" w:color="0056B3"/>
-              <w:left w:val="single" w:sz="18" w:space="0" w:color="0056B3"/>
-              <w:bottom w:val="single" w:sz="12" w:space="0" w:color="0056B3"/>
-              <w:right w:val="single" w:sz="6" w:space="0" w:color="0056B3"/>
-            </w:tcBorders>
-            <w:shd w:val="clear" w:color="auto" w:fill="E8F2FF"/>
-          </w:tcPr>
-          <w:p>
-            <w:pPr>
-              <w:spacing w:before="80" w:after="80"/>
-            </w:pPr>
-            <w:r>
-              <w:rPr>
-                <w:i/>
-                <w:color w:val="0B244A"/>
-              </w:rPr>
-              <w:t xml:space="preserve">   This section provides concise, ready-to-speak answers for project viva/presentation defense. Each answer is optimized for quick verbal delivery within 30–60 seconds.</w:t>
-            </w:r>
-          </w:p>
-        </w:tc>
-      </w:tr>
-    </w:tbl>
-    <w:p/>
-    <w:p>
-      <w:pPr>
-        <w:spacing w:before="160" w:after="40"/>
-      </w:pPr>
-      <w:r>
-        <w:rPr>
-          <w:b/>
-          <w:color w:val="0B244A"/>
-          <w:sz w:val="21"/>
-        </w:rPr>
-        <w:t>Q1.  What is CatalogForge in one sentence?</w:t>
-      </w:r>
-    </w:p>
-    <w:p>
-      <w:pPr>
-        <w:spacing w:after="120"/>
-        <w:ind w:left="360"/>
-        <w:jc w:val="both"/>
-      </w:pPr>
-      <w:r>
-        <w:rPr>
-          <w:color w:val="1A1A1A"/>
-          <w:sz w:val="21"/>
-        </w:rPr>
-        <w:t>CatalogForge is an enterprise AI product intelligence platform that ingests raw supplier spreadsheets, URLs, or nameplate photos and automatically outputs a verified, normalized 252-column master catalog sorted by department.</w:t>
-      </w:r>
-    </w:p>
-    <w:p>
-      <w:pPr>
-        <w:spacing w:before="160" w:after="40"/>
-      </w:pPr>
-      <w:r>
-        <w:rPr>
-          <w:b/>
-          <w:color w:val="0B244A"/>
-          <w:sz w:val="21"/>
-        </w:rPr>
-        <w:t>Q2.  What real-world problem does it solve?</w:t>
-      </w:r>
-    </w:p>
-    <w:p>
-      <w:pPr>
-        <w:spacing w:after="120"/>
-        <w:ind w:left="360"/>
-        <w:jc w:val="both"/>
-      </w:pPr>
-      <w:r>
-        <w:rPr>
-          <w:color w:val="1A1A1A"/>
-          <w:sz w:val="21"/>
-        </w:rPr>
-        <w:t>Industrial distributors spend 30 minutes manually researching every SKU from suppliers who provide messy, unstandardized data with missing categories and specs. CatalogForge automates this entire pipeline in under 20 seconds while guaranteeing zero AI hallucination.</w:t>
-      </w:r>
-    </w:p>
-    <w:p>
-      <w:pPr>
-        <w:spacing w:before="160" w:after="40"/>
-      </w:pPr>
-      <w:r>
-        <w:rPr>
-          <w:b/>
-          <w:color w:val="0B244A"/>
-          <w:sz w:val="21"/>
-        </w:rPr>
-        <w:lastRenderedPageBreak/>
-        <w:t>Q3.  How does CatalogForge prevent AI hallucinations?</w:t>
-      </w:r>
-    </w:p>
-    <w:p>
-      <w:pPr>
-        <w:spacing w:after="120"/>
-        <w:ind w:left="360"/>
-        <w:jc w:val="both"/>
-      </w:pPr>
-      <w:r>
-        <w:rPr>
-          <w:color w:val="1A1A1A"/>
-          <w:sz w:val="21"/>
-        </w:rPr>
-        <w:t>We enforce a strict zero-hallucination rule: any attribute that cannot be verified from an official manufacturer source with at least 60% confidence is strictly kept blank. We never allow the LLM to guess dimensions, voltages, or prices.</w:t>
-      </w:r>
-    </w:p>
-    <w:p>
-      <w:pPr>
-        <w:spacing w:before="160" w:after="40"/>
-      </w:pPr>
-      <w:r>
-        <w:rPr>
-          <w:b/>
-          <w:color w:val="0B244A"/>
-          <w:sz w:val="21"/>
-        </w:rPr>
-        <w:t>Q4.  How does the system determine product categories and taxonomy?</w:t>
-      </w:r>
-    </w:p>
-    <w:p>
-      <w:pPr>
-        <w:spacing w:after="120"/>
-        <w:ind w:left="360"/>
-        <w:jc w:val="both"/>
-      </w:pPr>
-      <w:r>
-        <w:rPr>
-          <w:color w:val="1A1A1A"/>
-          <w:sz w:val="21"/>
-        </w:rPr>
-        <w:t>We implement an authoritative 3-tier merchandise hierarchy: Department, Class, and Fine. For example, a dishwasher is automatically resolved to Dept: appliances, Class: large appliances, and Fine: dishwasher, and the final Excel delivery is sorted alphabetically by Department.</w:t>
-      </w:r>
-    </w:p>
-    <w:p>
-      <w:pPr>
-        <w:spacing w:before="160" w:after="40"/>
-      </w:pPr>
-      <w:r>
-        <w:rPr>
-          <w:b/>
-          <w:color w:val="0B244A"/>
-          <w:sz w:val="21"/>
-        </w:rPr>
-        <w:t>Q5.  Why do you filter out Amazon and Walmart?</w:t>
-      </w:r>
-    </w:p>
-    <w:p>
-      <w:pPr>
-        <w:spacing w:after="120"/>
-        <w:ind w:left="360"/>
-        <w:jc w:val="both"/>
-      </w:pPr>
-      <w:r>
-        <w:rPr>
-          <w:color w:val="1A1A1A"/>
-          <w:sz w:val="21"/>
-        </w:rPr>
-        <w:t>Consumer marketplaces contain third-party seller claims, affiliate spam, non-permanent image links, and lack authoritative engineering datasheets. We enforce a Source Governor that prioritizes Tier 1 OEM domains and completely blacklists 33 consumer marketplaces.</w:t>
-      </w:r>
-    </w:p>
-    <w:p>
-      <w:pPr>
-        <w:spacing w:before="160" w:after="40"/>
-      </w:pPr>
-      <w:r>
-        <w:rPr>
-          <w:b/>
-          <w:color w:val="0B244A"/>
-          <w:sz w:val="21"/>
-        </w:rPr>
-        <w:t>Q6.  How does the Multi-Modal Vision OCR work?</w:t>
-      </w:r>
-    </w:p>
-    <w:p>
-      <w:pPr>
-        <w:spacing w:after="120"/>
-        <w:ind w:left="360"/>
-        <w:jc w:val="both"/>
-      </w:pPr>
-      <w:r>
-        <w:rPr>
-          <w:color w:val="1A1A1A"/>
-          <w:sz w:val="21"/>
-        </w:rPr>
-        <w:t>Users can upload photos of physical product nameplates, stamped metal serial tags, or scanned catalog tables. Google Gemini Vision extracts technical ratings, governed by an automated Sufficiency Gatekeeper that rejects unreadable images if confidence is below 80%.</w:t>
-      </w:r>
-    </w:p>
-    <w:p>
-      <w:pPr>
-        <w:spacing w:before="160" w:after="40"/>
-      </w:pPr>
-      <w:r>
-        <w:rPr>
-          <w:b/>
-          <w:color w:val="0B244A"/>
-          <w:sz w:val="21"/>
-        </w:rPr>
-        <w:t>Q7.  What happens if an external API like Gemini or Tavily fails?</w:t>
-      </w:r>
-    </w:p>
-    <w:p>
-      <w:pPr>
-        <w:spacing w:after="120"/>
-        <w:ind w:left="360"/>
-        <w:jc w:val="both"/>
-      </w:pPr>
-      <w:r>
-        <w:rPr>
-          <w:color w:val="1A1A1A"/>
-          <w:sz w:val="21"/>
-        </w:rPr>
-        <w:t>Our pipeline has a multi-tier fallback cascade: if Gemini fails it attempts OpenAI GPT-4o-mini; if external AI is entirely unavailable, our deterministic regex and DOM scraper extracts specifications directly from the page HTML without crashing.</w:t>
-      </w:r>
-    </w:p>
-    <w:p>
-      <w:pPr>
-        <w:spacing w:before="160" w:after="40"/>
-      </w:pPr>
-      <w:r>
-        <w:rPr>
-          <w:b/>
-          <w:color w:val="0B244A"/>
-          <w:sz w:val="21"/>
-        </w:rPr>
-        <w:t>Q8.  How do you guarantee exported image and PDF links aren't broken?</w:t>
-      </w:r>
-    </w:p>
-    <w:p>
-      <w:pPr>
-        <w:spacing w:after="120"/>
-        <w:ind w:left="360"/>
-        <w:jc w:val="both"/>
-      </w:pPr>
-      <w:r>
-        <w:rPr>
-          <w:color w:val="1A1A1A"/>
-          <w:sz w:val="21"/>
-        </w:rPr>
-        <w:t>We built an automated Head-Check URL Health Verifier that issues async HTTP HEAD requests with a strict 3-second timeout. Any URL returning 404, 500, or a timeout is discarded, ensuring 100% live asset links in the final delivery file.</w:t>
-      </w:r>
-    </w:p>
-    <w:p>
-      <w:pPr>
-        <w:spacing w:before="160" w:after="40"/>
-      </w:pPr>
-      <w:r>
-        <w:rPr>
-          <w:b/>
-          <w:color w:val="0B244A"/>
-          <w:sz w:val="21"/>
-        </w:rPr>
-        <w:t>Q9.  How do you enforce UOM standards?</w:t>
-      </w:r>
-    </w:p>
-    <w:p>
-      <w:pPr>
-        <w:spacing w:after="120"/>
-        <w:ind w:left="360"/>
-        <w:jc w:val="both"/>
-      </w:pPr>
-      <w:r>
-        <w:rPr>
-          <w:color w:val="1A1A1A"/>
-          <w:sz w:val="21"/>
-        </w:rPr>
-        <w:t>We strictly implement the Unilog Master UOM Standards. We enforce exactly one space between the numeric value and unit—such as '24 in', never '24in'—and programmatically convert all 63 exact fraction increments from 1/64 to 63/64.</w:t>
-      </w:r>
-    </w:p>
-    <w:p>
-      <w:pPr>
-        <w:spacing w:before="160" w:after="40"/>
-      </w:pPr>
-      <w:r>
-        <w:rPr>
-          <w:b/>
-          <w:color w:val="0B244A"/>
-          <w:sz w:val="21"/>
-        </w:rPr>
-        <w:t>Q10. Why did you choose Fastify instead of Express?</w:t>
-      </w:r>
-    </w:p>
-    <w:p>
-      <w:pPr>
-        <w:spacing w:after="120"/>
-        <w:ind w:left="360"/>
-        <w:jc w:val="both"/>
-      </w:pPr>
-      <w:r>
-        <w:rPr>
-          <w:color w:val="1A1A1A"/>
-          <w:sz w:val="21"/>
-        </w:rPr>
-        <w:t>Fastify provides built-in JSON schema compilation and low overhead, delivering nearly double the throughput of Express, which is critical when processing high-volume batch catalogs concurrently.</w:t>
-      </w:r>
-    </w:p>
-    <w:p>
-      <w:pPr>
-        <w:spacing w:before="160" w:after="40"/>
-      </w:pPr>
-      <w:r>
-        <w:rPr>
-          <w:b/>
-          <w:color w:val="0B244A"/>
-          <w:sz w:val="21"/>
-        </w:rPr>
-        <w:t>Q11. What database do you use, and what happens if it's disconnected?</w:t>
-      </w:r>
-    </w:p>
-    <w:p>
-      <w:pPr>
-        <w:spacing w:after="120"/>
-        <w:ind w:left="360"/>
-        <w:jc w:val="both"/>
-      </w:pPr>
-      <w:r>
-        <w:rPr>
-          <w:color w:val="1A1A1A"/>
-          <w:sz w:val="21"/>
-        </w:rPr>
-        <w:t>We integrate with enterprise Azure SQL Database using connection pooling. For offline execution, demo environments, or local testing, our repositories automatically switch to in-memory object storage with zero code changes.</w:t>
-      </w:r>
-    </w:p>
-    <w:p>
-      <w:pPr>
-        <w:spacing w:before="160" w:after="40"/>
-      </w:pPr>
-      <w:r>
-        <w:rPr>
-          <w:b/>
-          <w:color w:val="0B244A"/>
-          <w:sz w:val="21"/>
-        </w:rPr>
-        <w:t>Q12. What are the 5 description tiers generated for each product?</w:t>
-      </w:r>
-    </w:p>
-    <w:p>
-      <w:pPr>
-        <w:spacing w:after="120"/>
-        <w:ind w:left="360"/>
-        <w:jc w:val="both"/>
-      </w:pPr>
-      <w:r>
-        <w:rPr>
-          <w:color w:val="1A1A1A"/>
-          <w:sz w:val="21"/>
-        </w:rPr>
-        <w:t>We generate INVOICE_DESC (max 40 uppercase chars), MOBILE_DESC (max 80 chars), SHORT_DESC (max 150 chars following the Unilog title formula), LONG_DESC1 (detailed technical specification sentence), and RETAIL_DESC.</w:t>
-      </w:r>
-    </w:p>
-    <w:p>
-      <w:pPr>
-        <w:spacing w:before="160" w:after="40"/>
-      </w:pPr>
-      <w:r>
-        <w:rPr>
-          <w:b/>
-          <w:color w:val="0B244A"/>
-          <w:sz w:val="21"/>
-        </w:rPr>
-        <w:lastRenderedPageBreak/>
-        <w:t>Q13. How does the system disambiguate distributors from real manufacturers?</w:t>
-      </w:r>
-    </w:p>
-    <w:p>
-      <w:pPr>
-        <w:spacing w:after="120"/>
-        <w:ind w:left="360"/>
-        <w:jc w:val="both"/>
-      </w:pPr>
-      <w:r>
-        <w:rPr>
-          <w:color w:val="1A1A1A"/>
-          <w:sz w:val="21"/>
-        </w:rPr>
-        <w:t>Supplier feeds often list distributors like 'Jam Industrial Supply' as the manufacturer. Our text sanitizer maintains a distributor blacklist and regex prefix stripper that resolves the true OEM—such as mapping '3MABR-7100075678' directly to 3M.</w:t>
-      </w:r>
-    </w:p>
-    <w:p>
-      <w:pPr>
-        <w:spacing w:before="160" w:after="40"/>
-      </w:pPr>
-      <w:r>
-        <w:rPr>
-          <w:b/>
-          <w:color w:val="0B244A"/>
-          <w:sz w:val="21"/>
-        </w:rPr>
-        <w:t>Q14. What makes CatalogForge scalable?</w:t>
-      </w:r>
-    </w:p>
-    <w:p>
-      <w:pPr>
-        <w:spacing w:after="120"/>
-        <w:ind w:left="360"/>
-        <w:jc w:val="both"/>
-      </w:pPr>
-      <w:r>
-        <w:rPr>
-          <w:color w:val="1A1A1A"/>
-          <w:sz w:val="21"/>
-        </w:rPr>
-        <w:t>Our API is completely stateless, batch enrichments run in controlled concurrent chunks, URL verifications are cached in-memory, and the architecture is ready to plug into distributed Redis worker queues.</w:t>
-      </w:r>
-    </w:p>
-    <w:p>
-      <w:pPr>
-        <w:spacing w:before="160" w:after="40"/>
-      </w:pPr>
-      <w:r>
-        <w:rPr>
-          <w:b/>
-          <w:color w:val="0B244A"/>
-          <w:sz w:val="21"/>
-        </w:rPr>
-        <w:t>Q15. How do you secure user data?</w:t>
-      </w:r>
-    </w:p>
-    <w:p>
-      <w:pPr>
-        <w:spacing w:after="120"/>
-        <w:ind w:left="360"/>
-        <w:jc w:val="both"/>
-      </w:pPr>
-      <w:r>
-        <w:rPr>
-          <w:color w:val="1A1A1A"/>
-          <w:sz w:val="21"/>
-        </w:rPr>
-        <w:t>We implement Firebase Admin JWT authentication with role-based access control, sanitize all input against script injection, parameterize all SQL queries, and store secrets strictly in validated environment variables.</w:t>
-      </w:r>
-    </w:p>
-    <w:p>
-      <w:pPr>
-        <w:spacing w:before="160" w:after="40"/>
-      </w:pPr>
-      <w:r>
-        <w:rPr>
-          <w:b/>
-          <w:color w:val="0B244A"/>
-          <w:sz w:val="21"/>
-        </w:rPr>
-        <w:t>Q16. What is the business ROI for an enterprise client?</w:t>
-      </w:r>
-    </w:p>
-    <w:p>
-      <w:pPr>
-        <w:spacing w:after="120"/>
-        <w:ind w:left="360"/>
-        <w:jc w:val="both"/>
-      </w:pPr>
-      <w:r>
-        <w:rPr>
-          <w:color w:val="1A1A1A"/>
-          <w:sz w:val="21"/>
-        </w:rPr>
-        <w:t>CatalogForge reduces catalog onboarding time by 95% and cuts manual labor costs from $20 per SKU to under 5 cents of compute, saving thousands of hours for distributor catalog teams.</w:t>
-      </w:r>
-    </w:p>
-    <w:p>
-      <w:pPr>
-        <w:spacing w:before="160" w:after="40"/>
-      </w:pPr>
-      <w:r>
-        <w:rPr>
-          <w:b/>
-          <w:color w:val="0B244A"/>
-          <w:sz w:val="21"/>
-        </w:rPr>
-        <w:t>Q17. Can CatalogForge process products outside of industrial and appliances?</w:t>
-      </w:r>
-    </w:p>
-    <w:p>
-      <w:pPr>
-        <w:spacing w:after="120"/>
-        <w:ind w:left="360"/>
-        <w:jc w:val="both"/>
-      </w:pPr>
-      <w:r>
-        <w:rPr>
-          <w:color w:val="1A1A1A"/>
-          <w:sz w:val="21"/>
-        </w:rPr>
-        <w:t>Yes. Our taxonomy engine covers abrasives, electrical equipment, lighting, hardware, fasteners, power tools, safety equipment, building materials, and plumbing, with a clean fallback for general industrial components.</w:t>
-      </w:r>
-    </w:p>
-    <w:p>
-      <w:pPr>
-        <w:spacing w:before="160" w:after="40"/>
-      </w:pPr>
-      <w:r>
-        <w:rPr>
-          <w:b/>
-          <w:color w:val="0B244A"/>
-          <w:sz w:val="21"/>
-        </w:rPr>
-        <w:t>Q18. What are the current limitations?</w:t>
-      </w:r>
-    </w:p>
-    <w:p>
-      <w:pPr>
-        <w:spacing w:after="120"/>
-        <w:ind w:left="360"/>
-        <w:jc w:val="both"/>
-      </w:pPr>
-      <w:r>
-        <w:rPr>
-          <w:color w:val="1A1A1A"/>
-          <w:sz w:val="21"/>
-        </w:rPr>
-        <w:t>Batch file enrichment is capped at controlled chunks to respect free-tier API quotas, and taxonomy definitions are rule-and-classpath driven rather than dynamically learned from vector embeddings. Prompts are currently English-only.</w:t>
-      </w:r>
-    </w:p>
-    <w:p>
-      <w:pPr>
-        <w:spacing w:before="160" w:after="40"/>
-      </w:pPr>
-      <w:r>
-        <w:rPr>
-          <w:b/>
-          <w:color w:val="0B244A"/>
-          <w:sz w:val="21"/>
-        </w:rPr>
-        <w:t>Q19. What is your roadmap for future development?</w:t>
-      </w:r>
-    </w:p>
-    <w:p>
-      <w:pPr>
-        <w:spacing w:after="120"/>
-        <w:ind w:left="360"/>
-        <w:jc w:val="both"/>
-      </w:pPr>
-      <w:r>
-        <w:rPr>
-          <w:color w:val="1A1A1A"/>
-          <w:sz w:val="21"/>
-        </w:rPr>
-        <w:t>Our future scope includes integrating distributed BullMQ/Redis worker queues, adding vector embeddings for semantic classification, enterprise single sign-on (SSO), and a human-in-the-loop review dashboard.</w:t>
-      </w:r>
-    </w:p>
-    <w:p>
-      <w:pPr>
-        <w:pBdr>
-          <w:bottom w:val="single" w:sz="6" w:space="1" w:color="B0C4DE"/>
-        </w:pBdr>
-        <w:spacing w:before="40" w:after="40"/>
-      </w:pPr>
-    </w:p>
-    <w:p>
-      <w:pPr>
-        <w:pBdr>
-          <w:bottom w:val="single" w:sz="12" w:space="4" w:color="0B244A"/>
-        </w:pBdr>
-        <w:spacing w:before="360"/>
-      </w:pPr>
-      <w:r>
-        <w:rPr>
-          <w:b/>
-          <w:color w:val="0B244A"/>
-          <w:sz w:val="40"/>
-        </w:rPr>
-        <w:t>25. Index of Core Technical Diagrams</w:t>
-      </w:r>
-    </w:p>
-    <w:tbl>
-      <w:tblPr>
-        <w:tblStyle w:val="TableGrid"/>
-        <w:tblW w:w="0" w:type="auto"/>
-        <w:jc w:val="center"/>
-        <w:tblLook w:val="04A0" w:firstRow="1" w:lastRow="0" w:firstColumn="1" w:lastColumn="0" w:noHBand="0" w:noVBand="1"/>
-      </w:tblPr>
-      <w:tblGrid>
-        <w:gridCol w:w="1271"/>
-        <w:gridCol w:w="3823"/>
-        <w:gridCol w:w="4482"/>
-      </w:tblGrid>
-      <w:tr>
-        <w:trPr>
-          <w:jc w:val="center"/>
-        </w:trPr>
-        <w:tc>
-          <w:tcPr>
-            <w:tcW w:w="1296" w:type="dxa"/>
-            <w:tcBorders>
-              <w:top w:val="single" w:sz="6" w:space="0" w:color="FFFFFF"/>
-              <w:left w:val="single" w:sz="4" w:space="0" w:color="FFFFFF"/>
-              <w:bottom w:val="single" w:sz="6" w:space="0" w:color="FFFFFF"/>
-              <w:right w:val="single" w:sz="4" w:space="0" w:color="FFFFFF"/>
-            </w:tcBorders>
-            <w:shd w:val="clear" w:color="auto" w:fill="0B244A"/>
-          </w:tcPr>
-          <w:p>
-            <w:pPr>
-              <w:spacing w:before="60" w:after="60"/>
-              <w:jc w:val="center"/>
-            </w:pPr>
-            <w:r>
-              <w:rPr>
-                <w:b/>
-                <w:color w:val="FFFFFF"/>
-                <w:sz w:val="19"/>
-              </w:rPr>
-              <w:t>Diagram</w:t>
-            </w:r>
-          </w:p>
-        </w:tc>
-        <w:tc>
-          <w:tcPr>
-            <w:tcW w:w="4032" w:type="dxa"/>
-            <w:tcBorders>
-              <w:top w:val="single" w:sz="6" w:space="0" w:color="FFFFFF"/>
-              <w:left w:val="single" w:sz="4" w:space="0" w:color="FFFFFF"/>
-              <w:bottom w:val="single" w:sz="6" w:space="0" w:color="FFFFFF"/>
-              <w:right w:val="single" w:sz="4" w:space="0" w:color="FFFFFF"/>
-            </w:tcBorders>
-            <w:shd w:val="clear" w:color="auto" w:fill="0B244A"/>
-          </w:tcPr>
-          <w:p>
-            <w:pPr>
-              <w:spacing w:before="60" w:after="60"/>
-              <w:jc w:val="center"/>
-            </w:pPr>
-            <w:r>
-              <w:rPr>
-                <w:b/>
-                <w:color w:val="FFFFFF"/>
-                <w:sz w:val="19"/>
-              </w:rPr>
-              <w:t>Title</w:t>
-            </w:r>
-          </w:p>
-        </w:tc>
-        <w:tc>
-          <w:tcPr>
-            <w:tcW w:w="4752" w:type="dxa"/>
-            <w:tcBorders>
-              <w:top w:val="single" w:sz="6" w:space="0" w:color="FFFFFF"/>
-              <w:left w:val="single" w:sz="4" w:space="0" w:color="FFFFFF"/>
-              <w:bottom w:val="single" w:sz="6" w:space="0" w:color="FFFFFF"/>
-              <w:right w:val="single" w:sz="4" w:space="0" w:color="FFFFFF"/>
-            </w:tcBorders>
-            <w:shd w:val="clear" w:color="auto" w:fill="0B244A"/>
-          </w:tcPr>
-          <w:p>
-            <w:pPr>
-              <w:spacing w:before="60" w:after="60"/>
-              <w:jc w:val="center"/>
-            </w:pPr>
-            <w:r>
-              <w:rPr>
-                <w:b/>
-                <w:color w:val="FFFFFF"/>
-                <w:sz w:val="19"/>
-              </w:rPr>
-              <w:t>Document Location</w:t>
-            </w:r>
-          </w:p>
-        </w:tc>
-      </w:tr>
-      <w:tr>
-        <w:trPr>
-          <w:jc w:val="center"/>
-        </w:trPr>
-        <w:tc>
-          <w:tcPr>
-            <w:tcW w:w="1296" w:type="dxa"/>
-            <w:tcBorders>
-              <w:top w:val="single" w:sz="4" w:space="0" w:color="D0DCF0"/>
-              <w:left w:val="single" w:sz="4" w:space="0" w:color="D0DCF0"/>
-              <w:bottom w:val="single" w:sz="4" w:space="0" w:color="D0DCF0"/>
-              <w:right w:val="single" w:sz="4" w:space="0" w:color="D0DCF0"/>
-            </w:tcBorders>
-            <w:shd w:val="clear" w:color="auto" w:fill="F2F5F9"/>
-          </w:tcPr>
-          <w:p>
-            <w:pPr>
-              <w:spacing w:before="40" w:after="40"/>
-            </w:pPr>
-            <w:r>
-              <w:rPr>
-                <w:color w:val="1A1A1A"/>
-                <w:sz w:val="18"/>
-              </w:rPr>
-              <w:t>Diagram 1</w:t>
-            </w:r>
-          </w:p>
-        </w:tc>
-        <w:tc>
-          <w:tcPr>
-            <w:tcW w:w="4032" w:type="dxa"/>
-            <w:tcBorders>
-              <w:top w:val="single" w:sz="4" w:space="0" w:color="D0DCF0"/>
-              <w:left w:val="single" w:sz="4" w:space="0" w:color="D0DCF0"/>
-              <w:bottom w:val="single" w:sz="4" w:space="0" w:color="D0DCF0"/>
-              <w:right w:val="single" w:sz="4" w:space="0" w:color="D0DCF0"/>
-            </w:tcBorders>
-            <w:shd w:val="clear" w:color="auto" w:fill="F2F5F9"/>
-          </w:tcPr>
-          <w:p>
-            <w:pPr>
-              <w:spacing w:before="40" w:after="40"/>
-            </w:pPr>
-            <w:r>
-              <w:rPr>
-                <w:color w:val="1A1A1A"/>
-                <w:sz w:val="18"/>
-              </w:rPr>
-              <w:t>Complete 12-Stage Processing Pipeline</w:t>
-            </w:r>
-          </w:p>
-        </w:tc>
-        <w:tc>
-          <w:tcPr>
-            <w:tcW w:w="4752" w:type="dxa"/>
-            <w:tcBorders>
-              <w:top w:val="single" w:sz="4" w:space="0" w:color="D0DCF0"/>
-              <w:left w:val="single" w:sz="4" w:space="0" w:color="D0DCF0"/>
-              <w:bottom w:val="single" w:sz="4" w:space="0" w:color="D0DCF0"/>
-              <w:right w:val="single" w:sz="4" w:space="0" w:color="D0DCF0"/>
-            </w:tcBorders>
-            <w:shd w:val="clear" w:color="auto" w:fill="F2F5F9"/>
-          </w:tcPr>
-          <w:p>
-            <w:pPr>
-              <w:spacing w:before="40" w:after="40"/>
-            </w:pPr>
-            <w:r>
-              <w:rPr>
-                <w:color w:val="1A1A1A"/>
-                <w:sz w:val="18"/>
-              </w:rPr>
-              <w:t>Section 2 — How CatalogForge Works</w:t>
-            </w:r>
-          </w:p>
-        </w:tc>
-      </w:tr>
-      <w:tr>
-        <w:trPr>
-          <w:jc w:val="center"/>
-        </w:trPr>
-        <w:tc>
-          <w:tcPr>
-            <w:tcW w:w="1296" w:type="dxa"/>
-            <w:tcBorders>
-              <w:top w:val="single" w:sz="4" w:space="0" w:color="D0DCF0"/>
-              <w:left w:val="single" w:sz="4" w:space="0" w:color="D0DCF0"/>
-              <w:bottom w:val="single" w:sz="4" w:space="0" w:color="D0DCF0"/>
-              <w:right w:val="single" w:sz="4" w:space="0" w:color="D0DCF0"/>
-            </w:tcBorders>
-            <w:shd w:val="clear" w:color="auto" w:fill="FFFFFF"/>
-          </w:tcPr>
-          <w:p>
-            <w:pPr>
-              <w:spacing w:before="40" w:after="40"/>
-            </w:pPr>
-            <w:r>
-              <w:rPr>
-                <w:color w:val="1A1A1A"/>
-                <w:sz w:val="18"/>
-              </w:rPr>
-              <w:t>Diagram 2</w:t>
-            </w:r>
-          </w:p>
-        </w:tc>
-        <w:tc>
-          <w:tcPr>
-            <w:tcW w:w="4032" w:type="dxa"/>
-            <w:tcBorders>
-              <w:top w:val="single" w:sz="4" w:space="0" w:color="D0DCF0"/>
-              <w:left w:val="single" w:sz="4" w:space="0" w:color="D0DCF0"/>
-              <w:bottom w:val="single" w:sz="4" w:space="0" w:color="D0DCF0"/>
-              <w:right w:val="single" w:sz="4" w:space="0" w:color="D0DCF0"/>
-            </w:tcBorders>
-            <w:shd w:val="clear" w:color="auto" w:fill="FFFFFF"/>
-          </w:tcPr>
-          <w:p>
-            <w:pPr>
-              <w:spacing w:before="40" w:after="40"/>
-            </w:pPr>
-            <w:r>
-              <w:rPr>
-                <w:color w:val="1A1A1A"/>
-                <w:sz w:val="18"/>
-              </w:rPr>
-              <w:t>Layered Architecture (Ingestion → Delivery)</w:t>
-            </w:r>
-          </w:p>
-        </w:tc>
-        <w:tc>
-          <w:tcPr>
-            <w:tcW w:w="4752" w:type="dxa"/>
-            <w:tcBorders>
-              <w:top w:val="single" w:sz="4" w:space="0" w:color="D0DCF0"/>
-              <w:left w:val="single" w:sz="4" w:space="0" w:color="D0DCF0"/>
-              <w:bottom w:val="single" w:sz="4" w:space="0" w:color="D0DCF0"/>
-              <w:right w:val="single" w:sz="4" w:space="0" w:color="D0DCF0"/>
-            </w:tcBorders>
-            <w:shd w:val="clear" w:color="auto" w:fill="FFFFFF"/>
-          </w:tcPr>
-          <w:p>
-            <w:pPr>
-              <w:spacing w:before="40" w:after="40"/>
-            </w:pPr>
-            <w:r>
-              <w:rPr>
-                <w:color w:val="1A1A1A"/>
-                <w:sz w:val="18"/>
-              </w:rPr>
-              <w:t>Section 3 — Pipeline Architecture</w:t>
-            </w:r>
-          </w:p>
-        </w:tc>
-      </w:tr>
-      <w:tr>
-        <w:trPr>
-          <w:jc w:val="center"/>
-        </w:trPr>
-        <w:tc>
-          <w:tcPr>
-            <w:tcW w:w="1296" w:type="dxa"/>
-            <w:tcBorders>
-              <w:top w:val="single" w:sz="4" w:space="0" w:color="D0DCF0"/>
-              <w:left w:val="single" w:sz="4" w:space="0" w:color="D0DCF0"/>
-              <w:bottom w:val="single" w:sz="4" w:space="0" w:color="D0DCF0"/>
-              <w:right w:val="single" w:sz="4" w:space="0" w:color="D0DCF0"/>
-            </w:tcBorders>
-            <w:shd w:val="clear" w:color="auto" w:fill="F2F5F9"/>
-          </w:tcPr>
-          <w:p>
-            <w:pPr>
-              <w:spacing w:before="40" w:after="40"/>
-            </w:pPr>
-            <w:r>
-              <w:rPr>
-                <w:color w:val="1A1A1A"/>
-                <w:sz w:val="18"/>
-              </w:rPr>
-              <w:t>Diagram 3</w:t>
-            </w:r>
-          </w:p>
-        </w:tc>
-        <w:tc>
-          <w:tcPr>
-            <w:tcW w:w="4032" w:type="dxa"/>
-            <w:tcBorders>
-              <w:top w:val="single" w:sz="4" w:space="0" w:color="D0DCF0"/>
-              <w:left w:val="single" w:sz="4" w:space="0" w:color="D0DCF0"/>
-              <w:bottom w:val="single" w:sz="4" w:space="0" w:color="D0DCF0"/>
-              <w:right w:val="single" w:sz="4" w:space="0" w:color="D0DCF0"/>
-            </w:tcBorders>
-            <w:shd w:val="clear" w:color="auto" w:fill="F2F5F9"/>
-          </w:tcPr>
-          <w:p>
-            <w:pPr>
-              <w:spacing w:before="40" w:after="40"/>
-            </w:pPr>
-            <w:r>
-              <w:rPr>
-                <w:color w:val="1A1A1A"/>
-                <w:sz w:val="18"/>
-              </w:rPr>
-              <w:t>Source Governance &amp; Sourcing Tier Decision Flow</w:t>
-            </w:r>
-          </w:p>
-        </w:tc>
-        <w:tc>
-          <w:tcPr>
-            <w:tcW w:w="4752" w:type="dxa"/>
-            <w:tcBorders>
-              <w:top w:val="single" w:sz="4" w:space="0" w:color="D0DCF0"/>
-              <w:left w:val="single" w:sz="4" w:space="0" w:color="D0DCF0"/>
-              <w:bottom w:val="single" w:sz="4" w:space="0" w:color="D0DCF0"/>
-              <w:right w:val="single" w:sz="4" w:space="0" w:color="D0DCF0"/>
-            </w:tcBorders>
-            <w:shd w:val="clear" w:color="auto" w:fill="F2F5F9"/>
-          </w:tcPr>
-          <w:p>
-            <w:pPr>
-              <w:spacing w:before="40" w:after="40"/>
-            </w:pPr>
-            <w:r>
-              <w:rPr>
-                <w:color w:val="1A1A1A"/>
-                <w:sz w:val="18"/>
-              </w:rPr>
-              <w:t>Section 5 — E-Commerce Filtering</w:t>
-            </w:r>
-          </w:p>
-        </w:tc>
-      </w:tr>
-      <w:tr>
-        <w:trPr>
-          <w:jc w:val="center"/>
-        </w:trPr>
-        <w:tc>
-          <w:tcPr>
-            <w:tcW w:w="1296" w:type="dxa"/>
-            <w:tcBorders>
-              <w:top w:val="single" w:sz="4" w:space="0" w:color="D0DCF0"/>
-              <w:left w:val="single" w:sz="4" w:space="0" w:color="D0DCF0"/>
-              <w:bottom w:val="single" w:sz="4" w:space="0" w:color="D0DCF0"/>
-              <w:right w:val="single" w:sz="4" w:space="0" w:color="D0DCF0"/>
-            </w:tcBorders>
-            <w:shd w:val="clear" w:color="auto" w:fill="FFFFFF"/>
-          </w:tcPr>
-          <w:p>
-            <w:pPr>
-              <w:spacing w:before="40" w:after="40"/>
-            </w:pPr>
-            <w:r>
-              <w:rPr>
-                <w:color w:val="1A1A1A"/>
-                <w:sz w:val="18"/>
-              </w:rPr>
-              <w:t>Diagram 4</w:t>
-            </w:r>
-          </w:p>
-        </w:tc>
-        <w:tc>
-          <w:tcPr>
-            <w:tcW w:w="4032" w:type="dxa"/>
-            <w:tcBorders>
-              <w:top w:val="single" w:sz="4" w:space="0" w:color="D0DCF0"/>
-              <w:left w:val="single" w:sz="4" w:space="0" w:color="D0DCF0"/>
-              <w:bottom w:val="single" w:sz="4" w:space="0" w:color="D0DCF0"/>
-              <w:right w:val="single" w:sz="4" w:space="0" w:color="D0DCF0"/>
-            </w:tcBorders>
-            <w:shd w:val="clear" w:color="auto" w:fill="FFFFFF"/>
-          </w:tcPr>
-          <w:p>
-            <w:pPr>
-              <w:spacing w:before="40" w:after="40"/>
-            </w:pPr>
-            <w:r>
-              <w:rPr>
-                <w:color w:val="1A1A1A"/>
-                <w:sz w:val="18"/>
-              </w:rPr>
-              <w:t>AI Engine Fallback Cascade</w:t>
-            </w:r>
-          </w:p>
-        </w:tc>
-        <w:tc>
-          <w:tcPr>
-            <w:tcW w:w="4752" w:type="dxa"/>
-            <w:tcBorders>
-              <w:top w:val="single" w:sz="4" w:space="0" w:color="D0DCF0"/>
-              <w:left w:val="single" w:sz="4" w:space="0" w:color="D0DCF0"/>
-              <w:bottom w:val="single" w:sz="4" w:space="0" w:color="D0DCF0"/>
-              <w:right w:val="single" w:sz="4" w:space="0" w:color="D0DCF0"/>
-            </w:tcBorders>
-            <w:shd w:val="clear" w:color="auto" w:fill="FFFFFF"/>
-          </w:tcPr>
-          <w:p>
-            <w:pPr>
-              <w:spacing w:before="40" w:after="40"/>
-            </w:pPr>
-            <w:r>
-              <w:rPr>
-                <w:color w:val="1A1A1A"/>
-                <w:sz w:val="18"/>
-              </w:rPr>
-              <w:t>Section 6 — Prompt Architecture</w:t>
-            </w:r>
-          </w:p>
-        </w:tc>
-      </w:tr>
-      <w:tr>
-        <w:trPr>
-          <w:jc w:val="center"/>
-        </w:trPr>
-        <w:tc>
-          <w:tcPr>
-            <w:tcW w:w="1296" w:type="dxa"/>
-            <w:tcBorders>
-              <w:top w:val="single" w:sz="4" w:space="0" w:color="D0DCF0"/>
-              <w:left w:val="single" w:sz="4" w:space="0" w:color="D0DCF0"/>
-              <w:bottom w:val="single" w:sz="4" w:space="0" w:color="D0DCF0"/>
-              <w:right w:val="single" w:sz="4" w:space="0" w:color="D0DCF0"/>
-            </w:tcBorders>
-            <w:shd w:val="clear" w:color="auto" w:fill="F2F5F9"/>
-          </w:tcPr>
-          <w:p>
-            <w:pPr>
-              <w:spacing w:before="40" w:after="40"/>
-            </w:pPr>
-            <w:r>
-              <w:rPr>
-                <w:color w:val="1A1A1A"/>
-                <w:sz w:val="18"/>
-              </w:rPr>
-              <w:t>Diagram 5</w:t>
-            </w:r>
-          </w:p>
-        </w:tc>
-        <w:tc>
-          <w:tcPr>
-            <w:tcW w:w="4032" w:type="dxa"/>
-            <w:tcBorders>
-              <w:top w:val="single" w:sz="4" w:space="0" w:color="D0DCF0"/>
-              <w:left w:val="single" w:sz="4" w:space="0" w:color="D0DCF0"/>
-              <w:bottom w:val="single" w:sz="4" w:space="0" w:color="D0DCF0"/>
-              <w:right w:val="single" w:sz="4" w:space="0" w:color="D0DCF0"/>
-            </w:tcBorders>
-            <w:shd w:val="clear" w:color="auto" w:fill="F2F5F9"/>
-          </w:tcPr>
-          <w:p>
-            <w:pPr>
-              <w:spacing w:before="40" w:after="40"/>
-            </w:pPr>
-            <w:r>
-              <w:rPr>
-                <w:color w:val="1A1A1A"/>
-                <w:sz w:val="18"/>
-              </w:rPr>
-              <w:t>3-Tier Taxonomy Classification Flow</w:t>
-            </w:r>
-          </w:p>
-        </w:tc>
-        <w:tc>
-          <w:tcPr>
-            <w:tcW w:w="4752" w:type="dxa"/>
-            <w:tcBorders>
-              <w:top w:val="single" w:sz="4" w:space="0" w:color="D0DCF0"/>
-              <w:left w:val="single" w:sz="4" w:space="0" w:color="D0DCF0"/>
-              <w:bottom w:val="single" w:sz="4" w:space="0" w:color="D0DCF0"/>
-              <w:right w:val="single" w:sz="4" w:space="0" w:color="D0DCF0"/>
-            </w:tcBorders>
-            <w:shd w:val="clear" w:color="auto" w:fill="F2F5F9"/>
-          </w:tcPr>
-          <w:p>
-            <w:pPr>
-              <w:spacing w:before="40" w:after="40"/>
-            </w:pPr>
-            <w:r>
-              <w:rPr>
-                <w:color w:val="1A1A1A"/>
-                <w:sz w:val="18"/>
-              </w:rPr>
-              <w:t>Section 7 — Taxonomy Engine</w:t>
-            </w:r>
-          </w:p>
-        </w:tc>
-      </w:tr>
-      <w:tr>
-        <w:trPr>
-          <w:jc w:val="center"/>
-        </w:trPr>
-        <w:tc>
-          <w:tcPr>
-            <w:tcW w:w="1296" w:type="dxa"/>
-            <w:tcBorders>
-              <w:top w:val="single" w:sz="4" w:space="0" w:color="D0DCF0"/>
-              <w:left w:val="single" w:sz="4" w:space="0" w:color="D0DCF0"/>
-              <w:bottom w:val="single" w:sz="4" w:space="0" w:color="D0DCF0"/>
-              <w:right w:val="single" w:sz="4" w:space="0" w:color="D0DCF0"/>
-            </w:tcBorders>
-            <w:shd w:val="clear" w:color="auto" w:fill="FFFFFF"/>
-          </w:tcPr>
-          <w:p>
-            <w:pPr>
-              <w:spacing w:before="40" w:after="40"/>
-            </w:pPr>
-            <w:r>
-              <w:rPr>
-                <w:color w:val="1A1A1A"/>
-                <w:sz w:val="18"/>
-              </w:rPr>
-              <w:t>Diagram 6</w:t>
-            </w:r>
-          </w:p>
-        </w:tc>
-        <w:tc>
-          <w:tcPr>
-            <w:tcW w:w="4032" w:type="dxa"/>
-            <w:tcBorders>
-              <w:top w:val="single" w:sz="4" w:space="0" w:color="D0DCF0"/>
-              <w:left w:val="single" w:sz="4" w:space="0" w:color="D0DCF0"/>
-              <w:bottom w:val="single" w:sz="4" w:space="0" w:color="D0DCF0"/>
-              <w:right w:val="single" w:sz="4" w:space="0" w:color="D0DCF0"/>
-            </w:tcBorders>
-            <w:shd w:val="clear" w:color="auto" w:fill="FFFFFF"/>
-          </w:tcPr>
-          <w:p>
-            <w:pPr>
-              <w:spacing w:before="40" w:after="40"/>
-            </w:pPr>
-            <w:r>
-              <w:rPr>
-                <w:color w:val="1A1A1A"/>
-                <w:sz w:val="18"/>
-              </w:rPr>
-              <w:t xml:space="preserve">Azure SQL Entity Hierarchy (JOB → PRODUCT </w:t>
-            </w:r>
-            <w:r>
-              <w:rPr>
-                <w:color w:val="1A1A1A"/>
-                <w:sz w:val="18"/>
-              </w:rPr>
-              <w:lastRenderedPageBreak/>
-              <w:t>→ Assets)</w:t>
-            </w:r>
-          </w:p>
-        </w:tc>
-        <w:tc>
-          <w:tcPr>
-            <w:tcW w:w="4752" w:type="dxa"/>
-            <w:tcBorders>
-              <w:top w:val="single" w:sz="4" w:space="0" w:color="D0DCF0"/>
-              <w:left w:val="single" w:sz="4" w:space="0" w:color="D0DCF0"/>
-              <w:bottom w:val="single" w:sz="4" w:space="0" w:color="D0DCF0"/>
-              <w:right w:val="single" w:sz="4" w:space="0" w:color="D0DCF0"/>
-            </w:tcBorders>
-            <w:shd w:val="clear" w:color="auto" w:fill="FFFFFF"/>
-          </w:tcPr>
-          <w:p>
-            <w:pPr>
-              <w:spacing w:before="40" w:after="40"/>
-            </w:pPr>
-            <w:r>
-              <w:rPr>
-                <w:color w:val="1A1A1A"/>
-                <w:sz w:val="18"/>
-              </w:rPr>
-              <w:lastRenderedPageBreak/>
-              <w:t>Section 8 — Data Model</w:t>
-            </w:r>
-          </w:p>
-        </w:tc>
-      </w:tr>
-      <w:tr>
-        <w:trPr>
-          <w:jc w:val="center"/>
-        </w:trPr>
-        <w:tc>
-          <w:tcPr>
-            <w:tcW w:w="1296" w:type="dxa"/>
-            <w:tcBorders>
-              <w:top w:val="single" w:sz="4" w:space="0" w:color="D0DCF0"/>
-              <w:left w:val="single" w:sz="4" w:space="0" w:color="D0DCF0"/>
-              <w:bottom w:val="single" w:sz="4" w:space="0" w:color="D0DCF0"/>
-              <w:right w:val="single" w:sz="4" w:space="0" w:color="D0DCF0"/>
-            </w:tcBorders>
-            <w:shd w:val="clear" w:color="auto" w:fill="F2F5F9"/>
-          </w:tcPr>
-          <w:p>
-            <w:pPr>
-              <w:spacing w:before="40" w:after="40"/>
-            </w:pPr>
-            <w:r>
-              <w:rPr>
-                <w:color w:val="1A1A1A"/>
-                <w:sz w:val="18"/>
-              </w:rPr>
-              <w:t>Diagram 7</w:t>
-            </w:r>
-          </w:p>
-        </w:tc>
-        <w:tc>
-          <w:tcPr>
-            <w:tcW w:w="4032" w:type="dxa"/>
-            <w:tcBorders>
-              <w:top w:val="single" w:sz="4" w:space="0" w:color="D0DCF0"/>
-              <w:left w:val="single" w:sz="4" w:space="0" w:color="D0DCF0"/>
-              <w:bottom w:val="single" w:sz="4" w:space="0" w:color="D0DCF0"/>
-              <w:right w:val="single" w:sz="4" w:space="0" w:color="D0DCF0"/>
-            </w:tcBorders>
-            <w:shd w:val="clear" w:color="auto" w:fill="F2F5F9"/>
-          </w:tcPr>
-          <w:p>
-            <w:pPr>
-              <w:spacing w:before="40" w:after="40"/>
-            </w:pPr>
-            <w:r>
-              <w:rPr>
-                <w:color w:val="1A1A1A"/>
-                <w:sz w:val="18"/>
-              </w:rPr>
-              <w:t>Multi-Tier Component Architecture</w:t>
-            </w:r>
-          </w:p>
-        </w:tc>
-        <w:tc>
-          <w:tcPr>
-            <w:tcW w:w="4752" w:type="dxa"/>
-            <w:tcBorders>
-              <w:top w:val="single" w:sz="4" w:space="0" w:color="D0DCF0"/>
-              <w:left w:val="single" w:sz="4" w:space="0" w:color="D0DCF0"/>
-              <w:bottom w:val="single" w:sz="4" w:space="0" w:color="D0DCF0"/>
-              <w:right w:val="single" w:sz="4" w:space="0" w:color="D0DCF0"/>
-            </w:tcBorders>
-            <w:shd w:val="clear" w:color="auto" w:fill="F2F5F9"/>
-          </w:tcPr>
-          <w:p>
-            <w:pPr>
-              <w:spacing w:before="40" w:after="40"/>
-            </w:pPr>
-            <w:r>
-              <w:rPr>
-                <w:color w:val="1A1A1A"/>
-                <w:sz w:val="18"/>
-              </w:rPr>
-              <w:t>Section 11 — Component Architecture</w:t>
-            </w:r>
-          </w:p>
-        </w:tc>
-      </w:tr>
-      <w:tr>
-        <w:trPr>
-          <w:jc w:val="center"/>
-        </w:trPr>
-        <w:tc>
-          <w:tcPr>
-            <w:tcW w:w="1296" w:type="dxa"/>
-            <w:tcBorders>
-              <w:top w:val="single" w:sz="4" w:space="0" w:color="D0DCF0"/>
-              <w:left w:val="single" w:sz="4" w:space="0" w:color="D0DCF0"/>
-              <w:bottom w:val="single" w:sz="4" w:space="0" w:color="D0DCF0"/>
-              <w:right w:val="single" w:sz="4" w:space="0" w:color="D0DCF0"/>
-            </w:tcBorders>
-            <w:shd w:val="clear" w:color="auto" w:fill="FFFFFF"/>
-          </w:tcPr>
-          <w:p>
-            <w:pPr>
-              <w:spacing w:before="40" w:after="40"/>
-            </w:pPr>
-            <w:r>
-              <w:rPr>
-                <w:color w:val="1A1A1A"/>
-                <w:sz w:val="18"/>
-              </w:rPr>
-              <w:t>Diagram 8</w:t>
-            </w:r>
-          </w:p>
-        </w:tc>
-        <w:tc>
-          <w:tcPr>
-            <w:tcW w:w="4032" w:type="dxa"/>
-            <w:tcBorders>
-              <w:top w:val="single" w:sz="4" w:space="0" w:color="D0DCF0"/>
-              <w:left w:val="single" w:sz="4" w:space="0" w:color="D0DCF0"/>
-              <w:bottom w:val="single" w:sz="4" w:space="0" w:color="D0DCF0"/>
-              <w:right w:val="single" w:sz="4" w:space="0" w:color="D0DCF0"/>
-            </w:tcBorders>
-            <w:shd w:val="clear" w:color="auto" w:fill="FFFFFF"/>
-          </w:tcPr>
-          <w:p>
-            <w:pPr>
-              <w:spacing w:before="40" w:after="40"/>
-            </w:pPr>
-            <w:r>
-              <w:rPr>
-                <w:color w:val="1A1A1A"/>
-                <w:sz w:val="18"/>
-              </w:rPr>
-              <w:t>KitchenAid KDFM404KPS End-to-End Lifecycle</w:t>
-            </w:r>
-          </w:p>
-        </w:tc>
-        <w:tc>
-          <w:tcPr>
-            <w:tcW w:w="4752" w:type="dxa"/>
-            <w:tcBorders>
-              <w:top w:val="single" w:sz="4" w:space="0" w:color="D0DCF0"/>
-              <w:left w:val="single" w:sz="4" w:space="0" w:color="D0DCF0"/>
-              <w:bottom w:val="single" w:sz="4" w:space="0" w:color="D0DCF0"/>
-              <w:right w:val="single" w:sz="4" w:space="0" w:color="D0DCF0"/>
-            </w:tcBorders>
-            <w:shd w:val="clear" w:color="auto" w:fill="FFFFFF"/>
-          </w:tcPr>
-          <w:p>
-            <w:pPr>
-              <w:spacing w:before="40" w:after="40"/>
-            </w:pPr>
-            <w:r>
-              <w:rPr>
-                <w:color w:val="1A1A1A"/>
-                <w:sz w:val="18"/>
-              </w:rPr>
-              <w:t>Section 13 — Lifecycle Walkthrough</w:t>
-            </w:r>
-          </w:p>
-        </w:tc>
-      </w:tr>
-      <w:tr>
-        <w:trPr>
-          <w:jc w:val="center"/>
-        </w:trPr>
-        <w:tc>
-          <w:tcPr>
-            <w:tcW w:w="1296" w:type="dxa"/>
-            <w:tcBorders>
-              <w:top w:val="single" w:sz="4" w:space="0" w:color="D0DCF0"/>
-              <w:left w:val="single" w:sz="4" w:space="0" w:color="D0DCF0"/>
-              <w:bottom w:val="single" w:sz="4" w:space="0" w:color="D0DCF0"/>
-              <w:right w:val="single" w:sz="4" w:space="0" w:color="D0DCF0"/>
-            </w:tcBorders>
-            <w:shd w:val="clear" w:color="auto" w:fill="F2F5F9"/>
-          </w:tcPr>
-          <w:p>
-            <w:pPr>
-              <w:spacing w:before="40" w:after="40"/>
-            </w:pPr>
-            <w:r>
-              <w:rPr>
-                <w:color w:val="1A1A1A"/>
-                <w:sz w:val="18"/>
-              </w:rPr>
-              <w:t>Diagram 9</w:t>
-            </w:r>
-          </w:p>
-        </w:tc>
-        <w:tc>
-          <w:tcPr>
-            <w:tcW w:w="4032" w:type="dxa"/>
-            <w:tcBorders>
-              <w:top w:val="single" w:sz="4" w:space="0" w:color="D0DCF0"/>
-              <w:left w:val="single" w:sz="4" w:space="0" w:color="D0DCF0"/>
-              <w:bottom w:val="single" w:sz="4" w:space="0" w:color="D0DCF0"/>
-              <w:right w:val="single" w:sz="4" w:space="0" w:color="D0DCF0"/>
-            </w:tcBorders>
-            <w:shd w:val="clear" w:color="auto" w:fill="F2F5F9"/>
-          </w:tcPr>
-          <w:p>
-            <w:pPr>
-              <w:spacing w:before="40" w:after="40"/>
-            </w:pPr>
-            <w:r>
-              <w:rPr>
-                <w:color w:val="1A1A1A"/>
-                <w:sz w:val="18"/>
-              </w:rPr>
-              <w:t>Fault-Tolerant Fallback &amp; Resilience Flow</w:t>
-            </w:r>
-          </w:p>
-        </w:tc>
-        <w:tc>
-          <w:tcPr>
-            <w:tcW w:w="4752" w:type="dxa"/>
-            <w:tcBorders>
-              <w:top w:val="single" w:sz="4" w:space="0" w:color="D0DCF0"/>
-              <w:left w:val="single" w:sz="4" w:space="0" w:color="D0DCF0"/>
-              <w:bottom w:val="single" w:sz="4" w:space="0" w:color="D0DCF0"/>
-              <w:right w:val="single" w:sz="4" w:space="0" w:color="D0DCF0"/>
-            </w:tcBorders>
-            <w:shd w:val="clear" w:color="auto" w:fill="F2F5F9"/>
-          </w:tcPr>
-          <w:p>
-            <w:pPr>
-              <w:spacing w:before="40" w:after="40"/>
-            </w:pPr>
-            <w:r>
-              <w:rPr>
-                <w:color w:val="1A1A1A"/>
-                <w:sz w:val="18"/>
-              </w:rPr>
-              <w:t>Section 14 — Error Handling</w:t>
-            </w:r>
-          </w:p>
-        </w:tc>
-      </w:tr>
-      <w:tr>
-        <w:trPr>
-          <w:jc w:val="center"/>
-        </w:trPr>
-        <w:tc>
-          <w:tcPr>
-            <w:tcW w:w="1296" w:type="dxa"/>
-            <w:tcBorders>
-              <w:top w:val="single" w:sz="4" w:space="0" w:color="D0DCF0"/>
-              <w:left w:val="single" w:sz="4" w:space="0" w:color="D0DCF0"/>
-              <w:bottom w:val="single" w:sz="4" w:space="0" w:color="D0DCF0"/>
-              <w:right w:val="single" w:sz="4" w:space="0" w:color="D0DCF0"/>
-            </w:tcBorders>
-            <w:shd w:val="clear" w:color="auto" w:fill="FFFFFF"/>
-          </w:tcPr>
-          <w:p>
-            <w:pPr>
-              <w:spacing w:before="40" w:after="40"/>
-            </w:pPr>
-            <w:r>
-              <w:rPr>
-                <w:color w:val="1A1A1A"/>
-                <w:sz w:val="18"/>
-              </w:rPr>
-              <w:t>Diagram 10</w:t>
-            </w:r>
-          </w:p>
-        </w:tc>
-        <w:tc>
-          <w:tcPr>
-            <w:tcW w:w="4032" w:type="dxa"/>
-            <w:tcBorders>
-              <w:top w:val="single" w:sz="4" w:space="0" w:color="D0DCF0"/>
-              <w:left w:val="single" w:sz="4" w:space="0" w:color="D0DCF0"/>
-              <w:bottom w:val="single" w:sz="4" w:space="0" w:color="D0DCF0"/>
-              <w:right w:val="single" w:sz="4" w:space="0" w:color="D0DCF0"/>
-            </w:tcBorders>
-            <w:shd w:val="clear" w:color="auto" w:fill="FFFFFF"/>
-          </w:tcPr>
-          <w:p>
-            <w:pPr>
-              <w:spacing w:before="40" w:after="40"/>
-            </w:pPr>
-            <w:r>
-              <w:rPr>
-                <w:color w:val="1A1A1A"/>
-                <w:sz w:val="18"/>
-              </w:rPr>
-              <w:t>Current vs. Future Scalability Architecture</w:t>
-            </w:r>
-          </w:p>
-        </w:tc>
-        <w:tc>
-          <w:tcPr>
-            <w:tcW w:w="4752" w:type="dxa"/>
-            <w:tcBorders>
-              <w:top w:val="single" w:sz="4" w:space="0" w:color="D0DCF0"/>
-              <w:left w:val="single" w:sz="4" w:space="0" w:color="D0DCF0"/>
-              <w:bottom w:val="single" w:sz="4" w:space="0" w:color="D0DCF0"/>
-              <w:right w:val="single" w:sz="4" w:space="0" w:color="D0DCF0"/>
-            </w:tcBorders>
-            <w:shd w:val="clear" w:color="auto" w:fill="FFFFFF"/>
-          </w:tcPr>
-          <w:p>
-            <w:pPr>
-              <w:spacing w:before="40" w:after="40"/>
-            </w:pPr>
-            <w:r>
-              <w:rPr>
-                <w:color w:val="1A1A1A"/>
-                <w:sz w:val="18"/>
-              </w:rPr>
-              <w:t>Section 15 — Scalability</w:t>
-            </w:r>
-          </w:p>
-        </w:tc>
-      </w:tr>
-      <w:tr>
-        <w:trPr>
-          <w:jc w:val="center"/>
-        </w:trPr>
-        <w:tc>
-          <w:tcPr>
-            <w:tcW w:w="1296" w:type="dxa"/>
-            <w:tcBorders>
-              <w:top w:val="single" w:sz="4" w:space="0" w:color="D0DCF0"/>
-              <w:left w:val="single" w:sz="4" w:space="0" w:color="D0DCF0"/>
-              <w:bottom w:val="single" w:sz="4" w:space="0" w:color="D0DCF0"/>
-              <w:right w:val="single" w:sz="4" w:space="0" w:color="D0DCF0"/>
-            </w:tcBorders>
-            <w:shd w:val="clear" w:color="auto" w:fill="F2F5F9"/>
-          </w:tcPr>
-          <w:p>
-            <w:pPr>
-              <w:spacing w:before="40" w:after="40"/>
-            </w:pPr>
-            <w:r>
-              <w:rPr>
-                <w:color w:val="1A1A1A"/>
-                <w:sz w:val="18"/>
-              </w:rPr>
-              <w:t>Diagram 11</w:t>
-            </w:r>
-          </w:p>
-        </w:tc>
-        <w:tc>
-          <w:tcPr>
-            <w:tcW w:w="4032" w:type="dxa"/>
-            <w:tcBorders>
-              <w:top w:val="single" w:sz="4" w:space="0" w:color="D0DCF0"/>
-              <w:left w:val="single" w:sz="4" w:space="0" w:color="D0DCF0"/>
-              <w:bottom w:val="single" w:sz="4" w:space="0" w:color="D0DCF0"/>
-              <w:right w:val="single" w:sz="4" w:space="0" w:color="D0DCF0"/>
-            </w:tcBorders>
-            <w:shd w:val="clear" w:color="auto" w:fill="F2F5F9"/>
-          </w:tcPr>
-          <w:p>
-            <w:pPr>
-              <w:spacing w:before="40" w:after="40"/>
-            </w:pPr>
-            <w:r>
-              <w:rPr>
-                <w:color w:val="1A1A1A"/>
-                <w:sz w:val="18"/>
-              </w:rPr>
-              <w:t>Production Cloud Deployment Architecture</w:t>
-            </w:r>
-          </w:p>
-        </w:tc>
-        <w:tc>
-          <w:tcPr>
-            <w:tcW w:w="4752" w:type="dxa"/>
-            <w:tcBorders>
-              <w:top w:val="single" w:sz="4" w:space="0" w:color="D0DCF0"/>
-              <w:left w:val="single" w:sz="4" w:space="0" w:color="D0DCF0"/>
-              <w:bottom w:val="single" w:sz="4" w:space="0" w:color="D0DCF0"/>
-              <w:right w:val="single" w:sz="4" w:space="0" w:color="D0DCF0"/>
-            </w:tcBorders>
-            <w:shd w:val="clear" w:color="auto" w:fill="F2F5F9"/>
-          </w:tcPr>
-          <w:p>
-            <w:pPr>
-              <w:spacing w:before="40" w:after="40"/>
-            </w:pPr>
-            <w:r>
-              <w:rPr>
-                <w:color w:val="1A1A1A"/>
-                <w:sz w:val="18"/>
-              </w:rPr>
-              <w:t>Section 23 — Deployment</w:t>
-            </w:r>
-          </w:p>
-        </w:tc>
-      </w:tr>
-    </w:tbl>
-    <w:p/>
-    <w:p>
-      <w:pPr>
-        <w:pBdr>
-          <w:bottom w:val="single" w:sz="6" w:space="1" w:color="B0C4DE"/>
-        </w:pBdr>
-        <w:spacing w:before="40" w:after="40"/>
-      </w:pPr>
-    </w:p>
-    <w:p>
-      <w:pPr>
-        <w:pBdr>
-          <w:bottom w:val="single" w:sz="12" w:space="4" w:color="0B244A"/>
-        </w:pBdr>
-        <w:spacing w:before="360"/>
-      </w:pPr>
-      <w:r>
-        <w:rPr>
-          <w:b/>
-          <w:color w:val="0B244A"/>
-          <w:sz w:val="40"/>
-        </w:rPr>
-        <w:t>26. Architecture Summary</w:t>
-      </w:r>
-    </w:p>
-    <w:p>
-      <w:pPr>
-        <w:spacing w:before="120" w:after="40"/>
-        <w:jc w:val="center"/>
-      </w:pPr>
-      <w:r>
-        <w:rPr>
-          <w:b/>
-          <w:color w:val="004080"/>
-          <w:sz w:val="20"/>
-        </w:rPr>
-        <w:t>[ End-to-End Architecture Summary ]</w:t>
-      </w:r>
-    </w:p>
-    <w:tbl>
-      <w:tblPr>
-        <w:tblW w:w="0" w:type="auto"/>
-        <w:jc w:val="center"/>
-        <w:tblBorders>
-          <w:top w:val="single" w:sz="6" w:space="0" w:color="003F7F"/>
-          <w:left w:val="single" w:sz="6" w:space="0" w:color="003F7F"/>
-          <w:bottom w:val="single" w:sz="6" w:space="0" w:color="003F7F"/>
-          <w:right w:val="single" w:sz="6" w:space="0" w:color="003F7F"/>
-        </w:tblBorders>
-        <w:tblLook w:val="04A0" w:firstRow="1" w:lastRow="0" w:firstColumn="1" w:lastColumn="0" w:noHBand="0" w:noVBand="1"/>
-      </w:tblPr>
-      <w:tblGrid>
-        <w:gridCol w:w="7920"/>
-      </w:tblGrid>
-      <w:tr>
-        <w:trPr>
-          <w:jc w:val="center"/>
-        </w:trPr>
-        <w:tc>
-          <w:tcPr>
-            <w:tcW w:w="7920" w:type="dxa"/>
-            <w:tcBorders>
-              <w:top w:val="single" w:sz="8" w:space="0" w:color="003F7F"/>
-              <w:left w:val="single" w:sz="8" w:space="0" w:color="003F7F"/>
-              <w:bottom w:val="single" w:sz="8" w:space="0" w:color="003F7F"/>
-              <w:right w:val="single" w:sz="8" w:space="0" w:color="003F7F"/>
-            </w:tcBorders>
-            <w:shd w:val="clear" w:color="auto" w:fill="0B244A"/>
-          </w:tcPr>
-          <w:p>
-            <w:pPr>
-              <w:spacing w:before="60" w:after="60"/>
-              <w:jc w:val="center"/>
-            </w:pPr>
-            <w:r>
-              <w:rPr>
-                <w:b/>
-                <w:color w:val="FFFFFF"/>
-                <w:sz w:val="20"/>
-              </w:rPr>
-              <w:t>INPUT SOURCES</w:t>
-            </w:r>
-            <w:r>
-              <w:rPr>
-                <w:b/>
-                <w:color w:val="FFFFFF"/>
-                <w:sz w:val="20"/>
-              </w:rPr>
-              <w:br/>
-              <w:t>Supplier Spreadsheets (.csv/.xlsx)  |  Nameplate Photos (Vision OCR)  |  Manufacturer URLs</w:t>
-            </w:r>
-          </w:p>
-        </w:tc>
-      </w:tr>
-    </w:tbl>
-    <w:p>
-      <w:pPr>
-        <w:spacing w:after="0"/>
-        <w:jc w:val="center"/>
-      </w:pPr>
-      <w:r>
-        <w:rPr>
-          <w:b/>
-          <w:color w:val="004080"/>
-          <w:sz w:val="28"/>
-        </w:rPr>
-        <w:t>↓</w:t>
-      </w:r>
-    </w:p>
-    <w:tbl>
-      <w:tblPr>
-        <w:tblW w:w="0" w:type="auto"/>
-        <w:jc w:val="center"/>
-        <w:tblBorders>
-          <w:top w:val="single" w:sz="6" w:space="0" w:color="003F7F"/>
-          <w:left w:val="single" w:sz="6" w:space="0" w:color="003F7F"/>
-          <w:bottom w:val="single" w:sz="6" w:space="0" w:color="003F7F"/>
-          <w:right w:val="single" w:sz="6" w:space="0" w:color="003F7F"/>
-        </w:tblBorders>
-        <w:tblLook w:val="04A0" w:firstRow="1" w:lastRow="0" w:firstColumn="1" w:lastColumn="0" w:noHBand="0" w:noVBand="1"/>
-      </w:tblPr>
-      <w:tblGrid>
-        <w:gridCol w:w="7920"/>
-      </w:tblGrid>
-      <w:tr>
-        <w:trPr>
-          <w:jc w:val="center"/>
-        </w:trPr>
-        <w:tc>
-          <w:tcPr>
-            <w:tcW w:w="7920" w:type="dxa"/>
-            <w:tcBorders>
-              <w:top w:val="single" w:sz="8" w:space="0" w:color="003F7F"/>
-              <w:left w:val="single" w:sz="8" w:space="0" w:color="003F7F"/>
-              <w:bottom w:val="single" w:sz="8" w:space="0" w:color="003F7F"/>
-              <w:right w:val="single" w:sz="8" w:space="0" w:color="003F7F"/>
-            </w:tcBorders>
-            <w:shd w:val="clear" w:color="auto" w:fill="0F6FD4"/>
-          </w:tcPr>
-          <w:p>
-            <w:pPr>
-              <w:spacing w:before="60" w:after="60"/>
-              <w:jc w:val="center"/>
-            </w:pPr>
-            <w:r>
-              <w:rPr>
-                <w:color w:val="FFFFFF"/>
-                <w:sz w:val="20"/>
-              </w:rPr>
-              <w:t>PRE-FLIGHT &amp; DISAMBIGUATION</w:t>
-            </w:r>
-            <w:r>
-              <w:rPr>
-                <w:color w:val="FFFFFF"/>
-                <w:sz w:val="20"/>
-              </w:rPr>
-              <w:br/>
-              <w:t>UTF-8 Sanitization  |  Distributor Stripping &amp; OEM Resolution  |  Sufficiency Gatekeeper (≥ 80%)</w:t>
-            </w:r>
-          </w:p>
-        </w:tc>
-      </w:tr>
-    </w:tbl>
-    <w:p>
-      <w:pPr>
-        <w:spacing w:after="0"/>
-        <w:jc w:val="center"/>
-      </w:pPr>
-      <w:r>
-        <w:rPr>
-          <w:b/>
-          <w:color w:val="004080"/>
-          <w:sz w:val="28"/>
-        </w:rPr>
-        <w:t>↓</w:t>
-      </w:r>
-    </w:p>
-    <w:tbl>
-      <w:tblPr>
-        <w:tblW w:w="0" w:type="auto"/>
-        <w:jc w:val="center"/>
-        <w:tblBorders>
-          <w:top w:val="single" w:sz="6" w:space="0" w:color="003F7F"/>
-          <w:left w:val="single" w:sz="6" w:space="0" w:color="003F7F"/>
-          <w:bottom w:val="single" w:sz="6" w:space="0" w:color="003F7F"/>
-          <w:right w:val="single" w:sz="6" w:space="0" w:color="003F7F"/>
-        </w:tblBorders>
-        <w:tblLook w:val="04A0" w:firstRow="1" w:lastRow="0" w:firstColumn="1" w:lastColumn="0" w:noHBand="0" w:noVBand="1"/>
-      </w:tblPr>
-      <w:tblGrid>
-        <w:gridCol w:w="7920"/>
-      </w:tblGrid>
-      <w:tr>
-        <w:trPr>
-          <w:jc w:val="center"/>
-        </w:trPr>
-        <w:tc>
-          <w:tcPr>
-            <w:tcW w:w="7920" w:type="dxa"/>
-            <w:tcBorders>
-              <w:top w:val="single" w:sz="8" w:space="0" w:color="003F7F"/>
-              <w:left w:val="single" w:sz="8" w:space="0" w:color="003F7F"/>
-              <w:bottom w:val="single" w:sz="8" w:space="0" w:color="003F7F"/>
-              <w:right w:val="single" w:sz="8" w:space="0" w:color="003F7F"/>
-            </w:tcBorders>
-            <w:shd w:val="clear" w:color="auto" w:fill="0F6FD4"/>
-          </w:tcPr>
-          <w:p>
-            <w:pPr>
-              <w:spacing w:before="60" w:after="60"/>
-              <w:jc w:val="center"/>
-            </w:pPr>
-            <w:r>
-              <w:rPr>
-                <w:color w:val="FFFFFF"/>
-                <w:sz w:val="20"/>
-              </w:rPr>
-              <w:t>SOURCE GOVERNANCE &amp; FILTERING</w:t>
-            </w:r>
-            <w:r>
-              <w:rPr>
-                <w:color w:val="FFFFFF"/>
-                <w:sz w:val="20"/>
-              </w:rPr>
-              <w:br/>
-              <w:t>33+ Consumer Marketplaces Purged  |  Search Exclusions Injected  |  Tier 1 OEM vs Tier 2 Distributor</w:t>
-            </w:r>
-          </w:p>
-        </w:tc>
-      </w:tr>
-    </w:tbl>
-    <w:p>
-      <w:pPr>
-        <w:spacing w:after="0"/>
-        <w:jc w:val="center"/>
-      </w:pPr>
-      <w:r>
-        <w:rPr>
-          <w:b/>
-          <w:color w:val="004080"/>
-          <w:sz w:val="28"/>
-        </w:rPr>
-        <w:t>↓</w:t>
-      </w:r>
-    </w:p>
-    <w:tbl>
-      <w:tblPr>
-        <w:tblW w:w="0" w:type="auto"/>
-        <w:jc w:val="center"/>
-        <w:tblBorders>
-          <w:top w:val="single" w:sz="6" w:space="0" w:color="003F7F"/>
-          <w:left w:val="single" w:sz="6" w:space="0" w:color="003F7F"/>
-          <w:bottom w:val="single" w:sz="6" w:space="0" w:color="003F7F"/>
-          <w:right w:val="single" w:sz="6" w:space="0" w:color="003F7F"/>
-        </w:tblBorders>
-        <w:tblLook w:val="04A0" w:firstRow="1" w:lastRow="0" w:firstColumn="1" w:lastColumn="0" w:noHBand="0" w:noVBand="1"/>
-      </w:tblPr>
-      <w:tblGrid>
-        <w:gridCol w:w="7920"/>
-      </w:tblGrid>
-      <w:tr>
-        <w:trPr>
-          <w:jc w:val="center"/>
-        </w:trPr>
-        <w:tc>
-          <w:tcPr>
-            <w:tcW w:w="7920" w:type="dxa"/>
-            <w:tcBorders>
-              <w:top w:val="single" w:sz="8" w:space="0" w:color="003F7F"/>
-              <w:left w:val="single" w:sz="8" w:space="0" w:color="003F7F"/>
-              <w:bottom w:val="single" w:sz="8" w:space="0" w:color="003F7F"/>
-              <w:right w:val="single" w:sz="8" w:space="0" w:color="003F7F"/>
-            </w:tcBorders>
-            <w:shd w:val="clear" w:color="auto" w:fill="0F6FD4"/>
-          </w:tcPr>
-          <w:p>
-            <w:pPr>
-              <w:spacing w:before="60" w:after="60"/>
-              <w:jc w:val="center"/>
-            </w:pPr>
-            <w:r>
-              <w:rPr>
-                <w:color w:val="FFFFFF"/>
-                <w:sz w:val="20"/>
-              </w:rPr>
-              <w:t>AI EXTRACTION &amp; NORMALIZATION</w:t>
-            </w:r>
-            <w:r>
-              <w:rPr>
-                <w:color w:val="FFFFFF"/>
-                <w:sz w:val="20"/>
-              </w:rPr>
-              <w:br/>
-              <w:t>Google Gemini 3.5 Flash-Lite (Temp 0.05)  |  5-Tier Character-Capped Descriptions</w:t>
-            </w:r>
-            <w:r>
-              <w:rPr>
-                <w:color w:val="FFFFFF"/>
-                <w:sz w:val="20"/>
-              </w:rPr>
-              <w:br/>
-              <w:t>Unilog UOM Formatting  |  3-Tier Taxonomy Mapping (Dept &gt; Class &gt; Fine)</w:t>
-            </w:r>
-          </w:p>
-        </w:tc>
-      </w:tr>
-    </w:tbl>
-    <w:p>
-      <w:pPr>
-        <w:spacing w:after="0"/>
-        <w:jc w:val="center"/>
-      </w:pPr>
-      <w:r>
-        <w:rPr>
-          <w:b/>
-          <w:color w:val="004080"/>
-          <w:sz w:val="28"/>
-        </w:rPr>
-        <w:t>↓</w:t>
-      </w:r>
-    </w:p>
-    <w:tbl>
-      <w:tblPr>
-        <w:tblW w:w="0" w:type="auto"/>
-        <w:jc w:val="center"/>
-        <w:tblBorders>
-          <w:top w:val="single" w:sz="6" w:space="0" w:color="003F7F"/>
-          <w:left w:val="single" w:sz="6" w:space="0" w:color="003F7F"/>
-          <w:bottom w:val="single" w:sz="6" w:space="0" w:color="003F7F"/>
-          <w:right w:val="single" w:sz="6" w:space="0" w:color="003F7F"/>
-        </w:tblBorders>
-        <w:tblLook w:val="04A0" w:firstRow="1" w:lastRow="0" w:firstColumn="1" w:lastColumn="0" w:noHBand="0" w:noVBand="1"/>
-      </w:tblPr>
-      <w:tblGrid>
-        <w:gridCol w:w="7920"/>
-      </w:tblGrid>
-      <w:tr>
-        <w:trPr>
-          <w:jc w:val="center"/>
-        </w:trPr>
-        <w:tc>
-          <w:tcPr>
-            <w:tcW w:w="7920" w:type="dxa"/>
-            <w:tcBorders>
-              <w:top w:val="single" w:sz="8" w:space="0" w:color="003F7F"/>
-              <w:left w:val="single" w:sz="8" w:space="0" w:color="003F7F"/>
-              <w:bottom w:val="single" w:sz="8" w:space="0" w:color="003F7F"/>
-              <w:right w:val="single" w:sz="8" w:space="0" w:color="003F7F"/>
-            </w:tcBorders>
-            <w:shd w:val="clear" w:color="auto" w:fill="20693A"/>
-          </w:tcPr>
-          <w:p>
-            <w:pPr>
-              <w:spacing w:before="60" w:after="60"/>
-              <w:jc w:val="center"/>
-            </w:pPr>
-            <w:r>
-              <w:rPr>
-                <w:color w:val="FFFFFF"/>
-                <w:sz w:val="20"/>
-              </w:rPr>
-              <w:t>VERIFICATION &amp; MASTER EXPORT</w:t>
-            </w:r>
-            <w:r>
-              <w:rPr>
-                <w:color w:val="FFFFFF"/>
-                <w:sz w:val="20"/>
-              </w:rPr>
-              <w:br/>
-              <w:t>Async HTTP HEAD Link Verification (3s)  |  Full 252-Column Schema Construction</w:t>
-            </w:r>
-            <w:r>
-              <w:rPr>
-                <w:color w:val="FFFFFF"/>
-                <w:sz w:val="20"/>
-              </w:rPr>
-              <w:br/>
-              <w:t>Department-Sorted Binary Excel (.xlsx) &amp; CSV Delivery</w:t>
-            </w:r>
-          </w:p>
-        </w:tc>
-      </w:tr>
-    </w:tbl>
-    <w:p/>
-    <w:p>
-      <w:pPr>
-        <w:pBdr>
-          <w:bottom w:val="single" w:sz="6" w:space="1" w:color="B0C4DE"/>
-        </w:pBdr>
-        <w:spacing w:before="40" w:after="40"/>
-      </w:pPr>
-    </w:p>
-    <w:p>
-      <w:pPr>
-        <w:pBdr>
-          <w:bottom w:val="single" w:sz="12" w:space="4" w:color="0B244A"/>
-        </w:pBdr>
-        <w:spacing w:before="360"/>
-      </w:pPr>
-      <w:r>
-        <w:rPr>
-          <w:b/>
-          <w:color w:val="0B244A"/>
-          <w:sz w:val="40"/>
-        </w:rPr>
-        <w:t>27. Current System Limitations</w:t>
-      </w:r>
-    </w:p>
-    <w:p>
-      <w:pPr>
-        <w:spacing w:before="20" w:after="60"/>
-        <w:ind w:left="576" w:hanging="180"/>
-      </w:pPr>
-      <w:r>
-        <w:rPr>
-          <w:color w:val="1A1A1A"/>
-        </w:rPr>
-        <w:lastRenderedPageBreak/>
-        <w:t>•  Batch Concurrency Quota Limits: To prevent HTTP 429 throttling against free-tier Google Gemini and Tavily API keys, batch uploads process in controlled chunks of 2 items with batch caps.</w:t>
-      </w:r>
-    </w:p>
-    <w:p>
-      <w:pPr>
-        <w:spacing w:before="20" w:after="60"/>
-        <w:ind w:left="576" w:hanging="180"/>
-      </w:pPr>
-      <w:r>
-        <w:rPr>
-          <w:color w:val="1A1A1A"/>
-        </w:rPr>
-        <w:t>•  Deterministic Taxonomy Coverage: The 3-tier taxonomy mapping is driven by keyword/classpath heuristics covering 10 primary catalog verticals; it does not currently use vector embeddings for arbitrary niche products.</w:t>
-      </w:r>
-    </w:p>
-    <w:p>
-      <w:pPr>
-        <w:spacing w:before="20" w:after="60"/>
-        <w:ind w:left="576" w:hanging="180"/>
-      </w:pPr>
-      <w:r>
-        <w:rPr>
-          <w:color w:val="1A1A1A"/>
-        </w:rPr>
-        <w:t>•  Language Scope: Prompts and descriptions are currently optimized for English-language catalog delivery specifications.</w:t>
-      </w:r>
-    </w:p>
-    <w:p>
-      <w:pPr>
-        <w:pBdr>
-          <w:bottom w:val="single" w:sz="6" w:space="1" w:color="B0C4DE"/>
-        </w:pBdr>
-        <w:spacing w:before="40" w:after="40"/>
-      </w:pPr>
-    </w:p>
-    <w:p>
-      <w:pPr>
-        <w:pBdr>
-          <w:bottom w:val="single" w:sz="12" w:space="4" w:color="0B244A"/>
-        </w:pBdr>
-        <w:spacing w:before="360"/>
-      </w:pPr>
-      <w:r>
-        <w:rPr>
-          <w:b/>
-          <w:color w:val="0B244A"/>
-          <w:sz w:val="40"/>
-        </w:rPr>
-        <w:t>28. Future Scope &amp; Roadmap</w:t>
-      </w:r>
-    </w:p>
-    <w:p>
-      <w:pPr>
-        <w:spacing w:before="20" w:after="60"/>
-        <w:ind w:left="576" w:hanging="180"/>
-      </w:pPr>
-      <w:r>
-        <w:rPr>
-          <w:color w:val="1A1A1A"/>
-        </w:rPr>
-        <w:t>•  Distributed Redis / BullMQ Task Queues: Decouple long-running multi-thousand SKU catalog files to background worker pools.</w:t>
-      </w:r>
-    </w:p>
-    <w:p>
-      <w:pPr>
-        <w:spacing w:before="20" w:after="60"/>
-        <w:ind w:left="576" w:hanging="180"/>
-      </w:pPr>
-      <w:r>
-        <w:rPr>
-          <w:color w:val="1A1A1A"/>
-        </w:rPr>
-        <w:t>•  Vector Embedding Taxonomy: Integrate Milvus / pgvector for semantic classification of ambiguous product descriptions.</w:t>
-      </w:r>
-    </w:p>
-    <w:p>
-      <w:pPr>
-        <w:spacing w:before="20" w:after="60"/>
-        <w:ind w:left="576" w:hanging="180"/>
-      </w:pPr>
-      <w:r>
-        <w:rPr>
-          <w:color w:val="1A1A1A"/>
-        </w:rPr>
-        <w:t>•  Human-in-the-Loop Review Dashboard: Enhanced visual diff editor allowing catalog managers to approve or edit individual attribute flags.</w:t>
-      </w:r>
-    </w:p>
-    <w:p>
-      <w:pPr>
-        <w:spacing w:before="20" w:after="60"/>
-        <w:ind w:left="576" w:hanging="180"/>
-      </w:pPr>
-      <w:r>
-        <w:rPr>
-          <w:color w:val="1A1A1A"/>
-        </w:rPr>
-        <w:t>•  Multi-Tenant Enterprise Organizations: Workspace isolation for multiple distributor teams with custom approval workflows.</w:t>
-      </w:r>
-    </w:p>
-    <w:p>
-      <w:pPr>
-        <w:spacing w:before="20" w:after="60"/>
-        <w:ind w:left="576" w:hanging="180"/>
-      </w:pPr>
-      <w:r>
-        <w:rPr>
-          <w:color w:val="1A1A1A"/>
-        </w:rPr>
-        <w:t>•  Enterprise SSO / SAML2: Integration with corporate identity providers for enterprise authentication.</w:t>
-      </w:r>
-    </w:p>
-    <w:p>
-      <w:pPr>
-        <w:spacing w:before="20" w:after="60"/>
-        <w:ind w:left="576" w:hanging="180"/>
-      </w:pPr>
-      <w:r>
-        <w:rPr>
-          <w:color w:val="1A1A1A"/>
-        </w:rPr>
-        <w:t>•  Advanced Analytics Dashboard: Real-time processing metrics, completeness trends, and department-level catalog insights.</w:t>
-      </w:r>
-    </w:p>
-    <w:p>
-      <w:pPr>
-        <w:pBdr>
-          <w:bottom w:val="single" w:sz="6" w:space="1" w:color="B0C4DE"/>
-        </w:pBdr>
-        <w:spacing w:before="40" w:after="40"/>
-      </w:pPr>
-    </w:p>
-    <w:p>
-      <w:pPr>
-        <w:pBdr>
-          <w:bottom w:val="single" w:sz="12" w:space="4" w:color="0B244A"/>
-        </w:pBdr>
-        <w:spacing w:before="360"/>
-      </w:pPr>
-      <w:r>
-        <w:rPr>
-          <w:b/>
-          <w:color w:val="0B244A"/>
-          <w:sz w:val="40"/>
-        </w:rPr>
-        <w:t>29. Final Project Summary</w:t>
-      </w:r>
-    </w:p>
-    <w:tbl>
-      <w:tblPr>
-        <w:tblW w:w="0" w:type="auto"/>
-        <w:jc w:val="center"/>
-        <w:tblLook w:val="04A0" w:firstRow="1" w:lastRow="0" w:firstColumn="1" w:lastColumn="0" w:noHBand="0" w:noVBand="1"/>
-      </w:tblPr>
-      <w:tblGrid>
-        <w:gridCol w:w="9360"/>
-      </w:tblGrid>
-      <w:tr>
-        <w:trPr>
-          <w:jc w:val="center"/>
-        </w:trPr>
-        <w:tc>
-          <w:tcPr>
-            <w:tcW w:w="9360" w:type="dxa"/>
-            <w:tcBorders>
-              <w:top w:val="single" w:sz="12" w:space="0" w:color="0056B3"/>
-              <w:left w:val="single" w:sz="18" w:space="0" w:color="0056B3"/>
-              <w:bottom w:val="single" w:sz="12" w:space="0" w:color="0056B3"/>
-              <w:right w:val="single" w:sz="6" w:space="0" w:color="0056B3"/>
-            </w:tcBorders>
-            <w:shd w:val="clear" w:color="auto" w:fill="E8F2FF"/>
-          </w:tcPr>
-          <w:p>
-            <w:pPr>
-              <w:spacing w:before="80" w:after="80"/>
-            </w:pPr>
-            <w:r>
-              <w:rPr>
-                <w:i/>
-                <w:color w:val="0B244A"/>
-              </w:rPr>
-              <w:t xml:space="preserve">   CatalogForge represents a complete, technically sound, and commercially viable solution to one of the most persistent bottlenecks in modern digital commerce: unstandardized, incomplete product data. By uniting multi-modal vision OCR, live OEM web intelligence, strict source governance, zero-hallucination validation guardrails, and automated 3-tier taxonomy classification, CatalogForge automates the creation of pristine, audit-ready 252-column master catalog deliverables. It reduces onboarding time by 95%, eliminates manual labor costs, and provides enterprise distributors with data integrity they can trust.</w:t>
-            </w:r>
-          </w:p>
-        </w:tc>
-      </w:tr>
-    </w:tbl>
-    <w:p/>
-    <w:tbl>
-      <w:tblPr>
-        <w:tblStyle w:val="TableGrid"/>
-        <w:tblW w:w="0" w:type="auto"/>
-        <w:jc w:val="center"/>
-        <w:tblLook w:val="04A0" w:firstRow="1" w:lastRow="0" w:firstColumn="1" w:lastColumn="0" w:noHBand="0" w:noVBand="1"/>
-      </w:tblPr>
-      <w:tblGrid>
-        <w:gridCol w:w="2089"/>
-        <w:gridCol w:w="7487"/>
-      </w:tblGrid>
-      <w:tr>
-        <w:trPr>
-          <w:jc w:val="center"/>
-        </w:trPr>
-        <w:tc>
-          <w:tcPr>
-            <w:tcW w:w="2160" w:type="dxa"/>
-            <w:tcBorders>
-              <w:top w:val="single" w:sz="6" w:space="0" w:color="FFFFFF"/>
-              <w:left w:val="single" w:sz="4" w:space="0" w:color="FFFFFF"/>
-              <w:bottom w:val="single" w:sz="6" w:space="0" w:color="FFFFFF"/>
-              <w:right w:val="single" w:sz="4" w:space="0" w:color="FFFFFF"/>
-            </w:tcBorders>
-            <w:shd w:val="clear" w:color="auto" w:fill="0B244A"/>
-          </w:tcPr>
-          <w:p>
-            <w:pPr>
-              <w:spacing w:before="60" w:after="60"/>
-              <w:jc w:val="center"/>
-            </w:pPr>
-            <w:r>
-              <w:rPr>
-                <w:b/>
-                <w:color w:val="FFFFFF"/>
-                <w:sz w:val="19"/>
-              </w:rPr>
-              <w:t>Dimension</w:t>
-            </w:r>
-          </w:p>
-        </w:tc>
-        <w:tc>
-          <w:tcPr>
-            <w:tcW w:w="7920" w:type="dxa"/>
-            <w:tcBorders>
-              <w:top w:val="single" w:sz="6" w:space="0" w:color="FFFFFF"/>
-              <w:left w:val="single" w:sz="4" w:space="0" w:color="FFFFFF"/>
-              <w:bottom w:val="single" w:sz="6" w:space="0" w:color="FFFFFF"/>
-              <w:right w:val="single" w:sz="4" w:space="0" w:color="FFFFFF"/>
-            </w:tcBorders>
-            <w:shd w:val="clear" w:color="auto" w:fill="0B244A"/>
-          </w:tcPr>
-          <w:p>
-            <w:pPr>
-              <w:spacing w:before="60" w:after="60"/>
-              <w:jc w:val="center"/>
-            </w:pPr>
-            <w:r>
-              <w:rPr>
-                <w:b/>
-                <w:color w:val="FFFFFF"/>
-                <w:sz w:val="19"/>
-              </w:rPr>
-              <w:t>Summary</w:t>
-            </w:r>
-          </w:p>
-        </w:tc>
-      </w:tr>
-      <w:tr>
-        <w:trPr>
-          <w:jc w:val="center"/>
-        </w:trPr>
-        <w:tc>
-          <w:tcPr>
-            <w:tcW w:w="2160" w:type="dxa"/>
-            <w:tcBorders>
-              <w:top w:val="single" w:sz="4" w:space="0" w:color="D0DCF0"/>
-              <w:left w:val="single" w:sz="4" w:space="0" w:color="D0DCF0"/>
-              <w:bottom w:val="single" w:sz="4" w:space="0" w:color="D0DCF0"/>
-              <w:right w:val="single" w:sz="4" w:space="0" w:color="D0DCF0"/>
-            </w:tcBorders>
-            <w:shd w:val="clear" w:color="auto" w:fill="F2F5F9"/>
-          </w:tcPr>
-          <w:p>
-            <w:pPr>
-              <w:spacing w:before="40" w:after="40"/>
-            </w:pPr>
-            <w:r>
-              <w:rPr>
-                <w:color w:val="1A1A1A"/>
-                <w:sz w:val="18"/>
-              </w:rPr>
-              <w:lastRenderedPageBreak/>
-              <w:t>Problem</w:t>
-            </w:r>
-          </w:p>
-        </w:tc>
-        <w:tc>
-          <w:tcPr>
-            <w:tcW w:w="7920" w:type="dxa"/>
-            <w:tcBorders>
-              <w:top w:val="single" w:sz="4" w:space="0" w:color="D0DCF0"/>
-              <w:left w:val="single" w:sz="4" w:space="0" w:color="D0DCF0"/>
-              <w:bottom w:val="single" w:sz="4" w:space="0" w:color="D0DCF0"/>
-              <w:right w:val="single" w:sz="4" w:space="0" w:color="D0DCF0"/>
-            </w:tcBorders>
-            <w:shd w:val="clear" w:color="auto" w:fill="F2F5F9"/>
-          </w:tcPr>
-          <w:p>
-            <w:pPr>
-              <w:spacing w:before="40" w:after="40"/>
-            </w:pPr>
-            <w:r>
-              <w:rPr>
-                <w:color w:val="1A1A1A"/>
-                <w:sz w:val="18"/>
-              </w:rPr>
-              <w:t>Suppliers provide messy, unstandardized product data missing categories, specs, and verified images</w:t>
-            </w:r>
-          </w:p>
-        </w:tc>
-      </w:tr>
-      <w:tr>
-        <w:trPr>
-          <w:jc w:val="center"/>
-        </w:trPr>
-        <w:tc>
-          <w:tcPr>
-            <w:tcW w:w="2160" w:type="dxa"/>
-            <w:tcBorders>
-              <w:top w:val="single" w:sz="4" w:space="0" w:color="D0DCF0"/>
-              <w:left w:val="single" w:sz="4" w:space="0" w:color="D0DCF0"/>
-              <w:bottom w:val="single" w:sz="4" w:space="0" w:color="D0DCF0"/>
-              <w:right w:val="single" w:sz="4" w:space="0" w:color="D0DCF0"/>
-            </w:tcBorders>
-            <w:shd w:val="clear" w:color="auto" w:fill="FFFFFF"/>
-          </w:tcPr>
-          <w:p>
-            <w:pPr>
-              <w:spacing w:before="40" w:after="40"/>
-            </w:pPr>
-            <w:r>
-              <w:rPr>
-                <w:color w:val="1A1A1A"/>
-                <w:sz w:val="18"/>
-              </w:rPr>
-              <w:t>Solution</w:t>
-            </w:r>
-          </w:p>
-        </w:tc>
-        <w:tc>
-          <w:tcPr>
-            <w:tcW w:w="7920" w:type="dxa"/>
-            <w:tcBorders>
-              <w:top w:val="single" w:sz="4" w:space="0" w:color="D0DCF0"/>
-              <w:left w:val="single" w:sz="4" w:space="0" w:color="D0DCF0"/>
-              <w:bottom w:val="single" w:sz="4" w:space="0" w:color="D0DCF0"/>
-              <w:right w:val="single" w:sz="4" w:space="0" w:color="D0DCF0"/>
-            </w:tcBorders>
-            <w:shd w:val="clear" w:color="auto" w:fill="FFFFFF"/>
-          </w:tcPr>
-          <w:p>
-            <w:pPr>
-              <w:spacing w:before="40" w:after="40"/>
-            </w:pPr>
-            <w:r>
-              <w:rPr>
-                <w:color w:val="1A1A1A"/>
-                <w:sz w:val="18"/>
-              </w:rPr>
-              <w:t>Automated AI platform transforming raw inputs into verified 252-column enterprise catalog records</w:t>
-            </w:r>
-          </w:p>
-        </w:tc>
-      </w:tr>
-      <w:tr>
-        <w:trPr>
-          <w:jc w:val="center"/>
-        </w:trPr>
-        <w:tc>
-          <w:tcPr>
-            <w:tcW w:w="2160" w:type="dxa"/>
-            <w:tcBorders>
-              <w:top w:val="single" w:sz="4" w:space="0" w:color="D0DCF0"/>
-              <w:left w:val="single" w:sz="4" w:space="0" w:color="D0DCF0"/>
-              <w:bottom w:val="single" w:sz="4" w:space="0" w:color="D0DCF0"/>
-              <w:right w:val="single" w:sz="4" w:space="0" w:color="D0DCF0"/>
-            </w:tcBorders>
-            <w:shd w:val="clear" w:color="auto" w:fill="F2F5F9"/>
-          </w:tcPr>
-          <w:p>
-            <w:pPr>
-              <w:spacing w:before="40" w:after="40"/>
-            </w:pPr>
-            <w:r>
-              <w:rPr>
-                <w:color w:val="1A1A1A"/>
-                <w:sz w:val="18"/>
-              </w:rPr>
-              <w:t>Core AI</w:t>
-            </w:r>
-          </w:p>
-        </w:tc>
-        <w:tc>
-          <w:tcPr>
-            <w:tcW w:w="7920" w:type="dxa"/>
-            <w:tcBorders>
-              <w:top w:val="single" w:sz="4" w:space="0" w:color="D0DCF0"/>
-              <w:left w:val="single" w:sz="4" w:space="0" w:color="D0DCF0"/>
-              <w:bottom w:val="single" w:sz="4" w:space="0" w:color="D0DCF0"/>
-              <w:right w:val="single" w:sz="4" w:space="0" w:color="D0DCF0"/>
-            </w:tcBorders>
-            <w:shd w:val="clear" w:color="auto" w:fill="F2F5F9"/>
-          </w:tcPr>
-          <w:p>
-            <w:pPr>
-              <w:spacing w:before="40" w:after="40"/>
-            </w:pPr>
-            <w:r>
-              <w:rPr>
-                <w:color w:val="1A1A1A"/>
-                <w:sz w:val="18"/>
-              </w:rPr>
-              <w:t>Google Gemini 3.5 Flash-Lite at temperature 0.05 with strict zero-hallucination governance</w:t>
-            </w:r>
-          </w:p>
-        </w:tc>
-      </w:tr>
-      <w:tr>
-        <w:trPr>
-          <w:jc w:val="center"/>
-        </w:trPr>
-        <w:tc>
-          <w:tcPr>
-            <w:tcW w:w="2160" w:type="dxa"/>
-            <w:tcBorders>
-              <w:top w:val="single" w:sz="4" w:space="0" w:color="D0DCF0"/>
-              <w:left w:val="single" w:sz="4" w:space="0" w:color="D0DCF0"/>
-              <w:bottom w:val="single" w:sz="4" w:space="0" w:color="D0DCF0"/>
-              <w:right w:val="single" w:sz="4" w:space="0" w:color="D0DCF0"/>
-            </w:tcBorders>
-            <w:shd w:val="clear" w:color="auto" w:fill="FFFFFF"/>
-          </w:tcPr>
-          <w:p>
-            <w:pPr>
-              <w:spacing w:before="40" w:after="40"/>
-            </w:pPr>
-            <w:r>
-              <w:rPr>
-                <w:color w:val="1A1A1A"/>
-                <w:sz w:val="18"/>
-              </w:rPr>
-              <w:t>Pipeline</w:t>
-            </w:r>
-          </w:p>
-        </w:tc>
-        <w:tc>
-          <w:tcPr>
-            <w:tcW w:w="7920" w:type="dxa"/>
-            <w:tcBorders>
-              <w:top w:val="single" w:sz="4" w:space="0" w:color="D0DCF0"/>
-              <w:left w:val="single" w:sz="4" w:space="0" w:color="D0DCF0"/>
-              <w:bottom w:val="single" w:sz="4" w:space="0" w:color="D0DCF0"/>
-              <w:right w:val="single" w:sz="4" w:space="0" w:color="D0DCF0"/>
-            </w:tcBorders>
-            <w:shd w:val="clear" w:color="auto" w:fill="FFFFFF"/>
-          </w:tcPr>
-          <w:p>
-            <w:pPr>
-              <w:spacing w:before="40" w:after="40"/>
-            </w:pPr>
-            <w:r>
-              <w:rPr>
-                <w:color w:val="1A1A1A"/>
-                <w:sz w:val="18"/>
-              </w:rPr>
-              <w:t>12-stage: Ingest → Validate → OCR → Disambiguate → Govern → Search → Extract → Normalize → Classify → Verify → Export → Sort</w:t>
-            </w:r>
-          </w:p>
-        </w:tc>
-      </w:tr>
-      <w:tr>
-        <w:trPr>
-          <w:jc w:val="center"/>
-        </w:trPr>
-        <w:tc>
-          <w:tcPr>
-            <w:tcW w:w="2160" w:type="dxa"/>
-            <w:tcBorders>
-              <w:top w:val="single" w:sz="4" w:space="0" w:color="D0DCF0"/>
-              <w:left w:val="single" w:sz="4" w:space="0" w:color="D0DCF0"/>
-              <w:bottom w:val="single" w:sz="4" w:space="0" w:color="D0DCF0"/>
-              <w:right w:val="single" w:sz="4" w:space="0" w:color="D0DCF0"/>
-            </w:tcBorders>
-            <w:shd w:val="clear" w:color="auto" w:fill="F2F5F9"/>
-          </w:tcPr>
-          <w:p>
-            <w:pPr>
-              <w:spacing w:before="40" w:after="40"/>
-            </w:pPr>
-            <w:r>
-              <w:rPr>
-                <w:color w:val="1A1A1A"/>
-                <w:sz w:val="18"/>
-              </w:rPr>
-              <w:t>Taxonomy</w:t>
-            </w:r>
-          </w:p>
-        </w:tc>
-        <w:tc>
-          <w:tcPr>
-            <w:tcW w:w="7920" w:type="dxa"/>
-            <w:tcBorders>
-              <w:top w:val="single" w:sz="4" w:space="0" w:color="D0DCF0"/>
-              <w:left w:val="single" w:sz="4" w:space="0" w:color="D0DCF0"/>
-              <w:bottom w:val="single" w:sz="4" w:space="0" w:color="D0DCF0"/>
-              <w:right w:val="single" w:sz="4" w:space="0" w:color="D0DCF0"/>
-            </w:tcBorders>
-            <w:shd w:val="clear" w:color="auto" w:fill="F2F5F9"/>
-          </w:tcPr>
-          <w:p>
-            <w:pPr>
-              <w:spacing w:before="40" w:after="40"/>
-            </w:pPr>
-            <w:r>
-              <w:rPr>
-                <w:color w:val="1A1A1A"/>
-                <w:sz w:val="18"/>
-              </w:rPr>
-              <w:t>Automated 3-tier: Dept &gt; Class &gt; Fine covering 10+ industrial/consumer verticals</w:t>
-            </w:r>
-          </w:p>
-        </w:tc>
-      </w:tr>
-      <w:tr>
-        <w:trPr>
-          <w:jc w:val="center"/>
-        </w:trPr>
-        <w:tc>
-          <w:tcPr>
-            <w:tcW w:w="2160" w:type="dxa"/>
-            <w:tcBorders>
-              <w:top w:val="single" w:sz="4" w:space="0" w:color="D0DCF0"/>
-              <w:left w:val="single" w:sz="4" w:space="0" w:color="D0DCF0"/>
-              <w:bottom w:val="single" w:sz="4" w:space="0" w:color="D0DCF0"/>
-              <w:right w:val="single" w:sz="4" w:space="0" w:color="D0DCF0"/>
-            </w:tcBorders>
-            <w:shd w:val="clear" w:color="auto" w:fill="FFFFFF"/>
-          </w:tcPr>
-          <w:p>
-            <w:pPr>
-              <w:spacing w:before="40" w:after="40"/>
-            </w:pPr>
-            <w:r>
-              <w:rPr>
-                <w:color w:val="1A1A1A"/>
-                <w:sz w:val="18"/>
-              </w:rPr>
-              <w:t>Delivery Format</w:t>
-            </w:r>
-          </w:p>
-        </w:tc>
-        <w:tc>
-          <w:tcPr>
-            <w:tcW w:w="7920" w:type="dxa"/>
-            <w:tcBorders>
-              <w:top w:val="single" w:sz="4" w:space="0" w:color="D0DCF0"/>
-              <w:left w:val="single" w:sz="4" w:space="0" w:color="D0DCF0"/>
-              <w:bottom w:val="single" w:sz="4" w:space="0" w:color="D0DCF0"/>
-              <w:right w:val="single" w:sz="4" w:space="0" w:color="D0DCF0"/>
-            </w:tcBorders>
-            <w:shd w:val="clear" w:color="auto" w:fill="FFFFFF"/>
-          </w:tcPr>
-          <w:p>
-            <w:pPr>
-              <w:spacing w:before="40" w:after="40"/>
-            </w:pPr>
-            <w:r>
-              <w:rPr>
-                <w:color w:val="1A1A1A"/>
-                <w:sz w:val="18"/>
-              </w:rPr>
-              <w:t>Exact 252-column Unilog/UniHack master catalog, sorted alphabetically by Department</w:t>
-            </w:r>
-          </w:p>
-        </w:tc>
-      </w:tr>
-      <w:tr>
-        <w:trPr>
-          <w:jc w:val="center"/>
-        </w:trPr>
-        <w:tc>
-          <w:tcPr>
-            <w:tcW w:w="2160" w:type="dxa"/>
-            <w:tcBorders>
-              <w:top w:val="single" w:sz="4" w:space="0" w:color="D0DCF0"/>
-              <w:left w:val="single" w:sz="4" w:space="0" w:color="D0DCF0"/>
-              <w:bottom w:val="single" w:sz="4" w:space="0" w:color="D0DCF0"/>
-              <w:right w:val="single" w:sz="4" w:space="0" w:color="D0DCF0"/>
-            </w:tcBorders>
-            <w:shd w:val="clear" w:color="auto" w:fill="F2F5F9"/>
-          </w:tcPr>
-          <w:p>
-            <w:pPr>
-              <w:spacing w:before="40" w:after="40"/>
-            </w:pPr>
-            <w:r>
-              <w:rPr>
-                <w:color w:val="1A1A1A"/>
-                <w:sz w:val="18"/>
-              </w:rPr>
-              <w:t>Business Value</w:t>
-            </w:r>
-          </w:p>
-        </w:tc>
-        <w:tc>
-          <w:tcPr>
-            <w:tcW w:w="7920" w:type="dxa"/>
-            <w:tcBorders>
-              <w:top w:val="single" w:sz="4" w:space="0" w:color="D0DCF0"/>
-              <w:left w:val="single" w:sz="4" w:space="0" w:color="D0DCF0"/>
-              <w:bottom w:val="single" w:sz="4" w:space="0" w:color="D0DCF0"/>
-              <w:right w:val="single" w:sz="4" w:space="0" w:color="D0DCF0"/>
-            </w:tcBorders>
-            <w:shd w:val="clear" w:color="auto" w:fill="F2F5F9"/>
-          </w:tcPr>
-          <w:p>
-            <w:pPr>
-              <w:spacing w:before="40" w:after="40"/>
-            </w:pPr>
-            <w:r>
-              <w:rPr>
-                <w:color w:val="1A1A1A"/>
-                <w:sz w:val="18"/>
-              </w:rPr>
-              <w:t>95% onboarding time reduction, 98% cost reduction per SKU, 100% live asset link guarantee</w:t>
-            </w:r>
-          </w:p>
-        </w:tc>
-      </w:tr>
-      <w:tr>
-        <w:trPr>
-          <w:jc w:val="center"/>
-        </w:trPr>
-        <w:tc>
-          <w:tcPr>
-            <w:tcW w:w="2160" w:type="dxa"/>
-            <w:tcBorders>
-              <w:top w:val="single" w:sz="4" w:space="0" w:color="D0DCF0"/>
-              <w:left w:val="single" w:sz="4" w:space="0" w:color="D0DCF0"/>
-              <w:bottom w:val="single" w:sz="4" w:space="0" w:color="D0DCF0"/>
-              <w:right w:val="single" w:sz="4" w:space="0" w:color="D0DCF0"/>
-            </w:tcBorders>
-            <w:shd w:val="clear" w:color="auto" w:fill="FFFFFF"/>
-          </w:tcPr>
-          <w:p>
-            <w:pPr>
-              <w:spacing w:before="40" w:after="40"/>
-            </w:pPr>
-            <w:r>
-              <w:rPr>
-                <w:color w:val="1A1A1A"/>
-                <w:sz w:val="18"/>
-              </w:rPr>
-              <w:t>Scalability</w:t>
-            </w:r>
-          </w:p>
-        </w:tc>
-        <w:tc>
-          <w:tcPr>
-            <w:tcW w:w="7920" w:type="dxa"/>
-            <w:tcBorders>
-              <w:top w:val="single" w:sz="4" w:space="0" w:color="D0DCF0"/>
-              <w:left w:val="single" w:sz="4" w:space="0" w:color="D0DCF0"/>
-              <w:bottom w:val="single" w:sz="4" w:space="0" w:color="D0DCF0"/>
-              <w:right w:val="single" w:sz="4" w:space="0" w:color="D0DCF0"/>
-            </w:tcBorders>
-            <w:shd w:val="clear" w:color="auto" w:fill="FFFFFF"/>
-          </w:tcPr>
-          <w:p>
-            <w:pPr>
-              <w:spacing w:before="40" w:after="40"/>
-            </w:pPr>
-            <w:r>
-              <w:rPr>
-                <w:color w:val="1A1A1A"/>
-                <w:sz w:val="18"/>
-              </w:rPr>
-              <w:t>Stateless Fastify API, chunked concurrency, connection pooling, ready for Redis worker queues</w:t>
-            </w:r>
-          </w:p>
-        </w:tc>
-      </w:tr>
-      <w:tr>
-        <w:trPr>
-          <w:jc w:val="center"/>
-        </w:trPr>
-        <w:tc>
-          <w:tcPr>
-            <w:tcW w:w="2160" w:type="dxa"/>
-            <w:tcBorders>
-              <w:top w:val="single" w:sz="4" w:space="0" w:color="D0DCF0"/>
-              <w:left w:val="single" w:sz="4" w:space="0" w:color="D0DCF0"/>
-              <w:bottom w:val="single" w:sz="4" w:space="0" w:color="D0DCF0"/>
-              <w:right w:val="single" w:sz="4" w:space="0" w:color="D0DCF0"/>
-            </w:tcBorders>
-            <w:shd w:val="clear" w:color="auto" w:fill="F2F5F9"/>
-          </w:tcPr>
-          <w:p>
-            <w:pPr>
-              <w:spacing w:before="40" w:after="40"/>
-            </w:pPr>
-            <w:r>
-              <w:rPr>
-                <w:color w:val="1A1A1A"/>
-                <w:sz w:val="18"/>
-              </w:rPr>
-              <w:t>Production Status</w:t>
-            </w:r>
-          </w:p>
-        </w:tc>
-        <w:tc>
-          <w:tcPr>
-            <w:tcW w:w="7920" w:type="dxa"/>
-            <w:tcBorders>
-              <w:top w:val="single" w:sz="4" w:space="0" w:color="D0DCF0"/>
-              <w:left w:val="single" w:sz="4" w:space="0" w:color="D0DCF0"/>
-              <w:bottom w:val="single" w:sz="4" w:space="0" w:color="D0DCF0"/>
-              <w:right w:val="single" w:sz="4" w:space="0" w:color="D0DCF0"/>
-            </w:tcBorders>
-            <w:shd w:val="clear" w:color="auto" w:fill="F2F5F9"/>
-          </w:tcPr>
-          <w:p>
-            <w:pPr>
-              <w:spacing w:before="40" w:after="40"/>
-            </w:pPr>
-            <w:r>
-              <w:rPr>
-                <w:color w:val="1A1A1A"/>
-                <w:sz w:val="18"/>
-              </w:rPr>
-              <w:t>Production Ready for enterprise pilot deployment with automated unit test coverage</w:t>
-            </w:r>
-          </w:p>
-        </w:tc>
-      </w:tr>
-    </w:tbl>
-    <w:p/>
-    <w:p/>
-    <w:p>
-      <w:pPr>
-        <w:spacing w:before="240" w:after="0"/>
-        <w:jc w:val="center"/>
-      </w:pPr>
-      <w:r>
-        <w:rPr>
-          <w:i/>
-          <w:color w:val="607090"/>
-          <w:sz w:val="20"/>
-        </w:rPr>
-        <w:t>— End of CatalogForge Complete Technical &amp; Business Documentation —</w:t>
-      </w:r>
-    </w:p>
     <w:sectPr>
       <w:pgSz w:w="12240" w:h="15840"/>
       <w:pgMar w:top="1440" w:right="1440" w:bottom="1440" w:left="1440" w:header="720" w:footer="720" w:gutter="0"/>

</xml_diff>